<commit_message>
W8 materials updated Oct 27th 2026
</commit_message>
<xml_diff>
--- a/lectures/week08/Week8_Control_Theory_Basics.docx
+++ b/lectures/week08/Week8_Control_Theory_Basics.docx
@@ -92,7 +92,7 @@
         </w:rPr>
         <w:t xml:space="preserve">This handout is the background for §3 of the </w:t>
       </w:r>
-      <w:hyperlink w:history="1" r:id="rIdsium7foylf7jfbeew8rp_">
+      <w:hyperlink w:history="1" r:id="rIdgafwsjaasd2me1grnqfsk">
         <w:r>
           <w:rPr>
             <w:rFonts w:ascii="Cambria" w:cs="Cambria" w:eastAsia="Cambria" w:hAnsi="Cambria"/>
@@ -10353,7 +10353,7 @@
       <w:r>
         <w:drawing>
           <wp:inline distT="0" distB="0" distL="0" distR="0">
-            <wp:extent cx="5715000" cy="2781300"/>
+            <wp:extent cx="5715000" cy="2971800"/>
             <wp:effectExtent t="0" r="0" b="0" l="0"/>
             <wp:docPr id="1" name="" descr="" title=""/>
             <wp:cNvGraphicFramePr>
@@ -10378,7 +10378,7 @@
                   <pic:spPr bwMode="auto">
                     <a:xfrm>
                       <a:off x="0" y="0"/>
-                      <a:ext cx="5715000" cy="2781300"/>
+                      <a:ext cx="5715000" cy="2971800"/>
                     </a:xfrm>
                     <a:prstGeom prst="rect">
                       <a:avLst/>
@@ -10415,7 +10415,7 @@
           <w:sz w:val="19"/>
           <w:szCs w:val="19"/>
         </w:rPr>
-        <w:t xml:space="preserve">The poles of the cart alone and of the four closed loops, in the complex plane. A pole to the right of the vertical line would grow. The PID loop has a third pole at −53.1, off the left edge.</w:t>
+        <w:t xml:space="preserve">The poles of the cart alone and of the four closed loops, in the complex plane. A pole to the right of the vertical line would grow. The real axis is broken between −50 and −20, so that the PID loop's third pole, at −53.1, fits on the page.</w:t>
       </w:r>
     </w:p>
     <w:p>
@@ -13017,7 +13017,7 @@
           <w:sz w:val="22"/>
           <w:szCs w:val="22"/>
         </w:rPr>
-        <w:t xml:space="preserve">This week's model has no muscles (notes §1.3), so the hand has no spring and no damper of its own. Near the start posture it is a mass. Week 6 found that this mass depends on the direction of the push: 0.30 kg along the hand's light axis and 2.09 kg along its heavy axis (Week 6 §2.1).</w:t>
+        <w:t xml:space="preserve">This week's model has no muscles (notes §1.3), so the hand has no spring and no damper of its own. Near the start posture it is a mass. Week 6 found that this mass depends on the direction of the push: 0.30 kg along the hand's light axis and 2.09 kg along its heavy axis, at right angles (Week 6 §2.1; Figure 8A).</w:t>
       </w:r>
     </w:p>
     <w:p>
@@ -13033,7 +13033,40 @@
           <w:sz w:val="22"/>
           <w:szCs w:val="22"/>
         </w:rPr>
-        <w:t xml:space="preserve">Along either axis, Equation H.1 with b = k = 0 gives G(s) = 1/(m s²). A PD controller that commands a force, F = K e + D ė, gives the denominator m s² + D s + K. Dividing by m and matching Board 6's form gives</w:t>
+        <w:t xml:space="preserve">This board repeats Boards 3, 5 and 6 for the hand, one step at a time. Work along one axis, with m standing for either mass.</w:t>
+      </w:r>
+    </w:p>
+    <w:p>
+      <w:pPr>
+        <w:keepNext/>
+        <w:spacing w:after="130" w:before="280"/>
+      </w:pPr>
+      <w:r>
+        <w:rPr>
+          <w:rFonts w:ascii="Georgia" w:cs="Georgia" w:eastAsia="Georgia" w:hAnsi="Georgia"/>
+          <w:b/>
+          <w:bCs/>
+          <w:color w:val="2E86AB"/>
+          <w:sz w:val="26"/>
+          <w:szCs w:val="26"/>
+        </w:rPr>
+        <w:t xml:space="preserve">Step 1. The hand alone</w:t>
+      </w:r>
+    </w:p>
+    <w:p>
+      <w:pPr>
+        <w:keepNext/>
+        <w:spacing w:after="140" w:before="0" w:line="276"/>
+        <w:jc w:val="left"/>
+      </w:pPr>
+      <w:r>
+        <w:rPr>
+          <w:rFonts w:ascii="Cambria" w:cs="Cambria" w:eastAsia="Cambria" w:hAnsi="Cambria"/>
+          <w:color w:val="333333"/>
+          <w:sz w:val="22"/>
+          <w:szCs w:val="22"/>
+        </w:rPr>
+        <w:t xml:space="preserve">Equation H.1 with no damper and no spring (b = k = 0) leaves Newton's second law, m ẍ = F. Transform it with the hand at rest at t = 0. By Equation H.6 applied twice, ẍ becomes s²X(s), so m s² X(s) = F(s). Dividing by m s² gives the hand's transfer function:</w:t>
       </w:r>
     </w:p>
     <w:p>
@@ -13051,26 +13084,7 @@
           <w:sz w:val="24"/>
           <w:szCs w:val="24"/>
         </w:rPr>
-        <w:t xml:space="preserve">ω</w:t>
-      </w:r>
-      <w:r>
-        <w:rPr>
-          <w:rFonts w:ascii="Cambria" w:cs="Cambria" w:eastAsia="Cambria" w:hAnsi="Cambria"/>
-          <w:color w:val="333333"/>
-          <w:sz w:val="24"/>
-          <w:szCs w:val="24"/>
-          <w:vertAlign w:val="subscript"/>
-        </w:rPr>
-        <w:t xml:space="preserve">n</w:t>
-      </w:r>
-      <w:r>
-        <w:rPr>
-          <w:rFonts w:ascii="Cambria" w:cs="Cambria" w:eastAsia="Cambria" w:hAnsi="Cambria"/>
-          <w:color w:val="333333"/>
-          <w:sz w:val="24"/>
-          <w:szCs w:val="24"/>
-        </w:rPr>
-        <w:t xml:space="preserve">  =  √(K/m),        ζ  =  D / (2√(K m))</w:t>
+        <w:t xml:space="preserve">G(s)  =  X(s) / F(s)  =  1 / (m s²)</w:t>
       </w:r>
       <w:r>
         <w:rPr>
@@ -13096,659 +13110,13 @@
           <w:sz w:val="22"/>
           <w:szCs w:val="22"/>
         </w:rPr>
-        <w:t xml:space="preserve">The same gains act on two different masses. With K = 10 N/m and D = 2 N s/m, the light axis has ζ = 0.58 and overshoots by 11%. The heavy axis has ζ = 0.22 and overshoots by 49% (Figure 7A). The two damping ratios differ by √(2.09/0.30) = 2.6.</w:t>
-      </w:r>
-    </w:p>
-    <w:p>
-      <w:pPr>
-        <w:keepNext w:val="false"/>
-        <w:spacing w:after="140" w:before="0" w:line="276"/>
-        <w:jc w:val="left"/>
-      </w:pPr>
-      <w:r>
-        <w:rPr>
-          <w:rFonts w:ascii="Cambria" w:cs="Cambria" w:eastAsia="Cambria" w:hAnsi="Cambria"/>
-          <w:color w:val="333333"/>
-          <w:sz w:val="22"/>
-          <w:szCs w:val="22"/>
-        </w:rPr>
-        <w:t xml:space="preserve">Week 6's inverse dynamics removes the difference. The controller commands a hand acceleration a, and τ = M(q) J(q)</w:t>
-      </w:r>
-      <w:r>
-        <w:rPr>
-          <w:rFonts w:ascii="Cambria" w:cs="Cambria" w:eastAsia="Cambria" w:hAnsi="Cambria"/>
-          <w:color w:val="333333"/>
-          <w:sz w:val="22"/>
-          <w:szCs w:val="22"/>
-          <w:vertAlign w:val="superscript"/>
-        </w:rPr>
-        <w:t xml:space="preserve">−1</w:t>
-      </w:r>
-      <w:r>
-        <w:rPr>
-          <w:rFonts w:ascii="Cambria" w:cs="Cambria" w:eastAsia="Cambria" w:hAnsi="Cambria"/>
-          <w:color w:val="333333"/>
-          <w:sz w:val="22"/>
-          <w:szCs w:val="22"/>
-        </w:rPr>
-        <w:t xml:space="preserve"> a turns it into torque (notes Figure 3). The hand then accelerates as commanded in every direction, so G(s) = 1/s². A PD command a = K</w:t>
-      </w:r>
-      <w:r>
-        <w:rPr>
-          <w:rFonts w:ascii="Cambria" w:cs="Cambria" w:eastAsia="Cambria" w:hAnsi="Cambria"/>
-          <w:color w:val="333333"/>
-          <w:sz w:val="22"/>
-          <w:szCs w:val="22"/>
-          <w:vertAlign w:val="subscript"/>
-        </w:rPr>
-        <w:t xml:space="preserve">p</w:t>
-      </w:r>
-      <w:r>
-        <w:rPr>
-          <w:rFonts w:ascii="Cambria" w:cs="Cambria" w:eastAsia="Cambria" w:hAnsi="Cambria"/>
-          <w:color w:val="333333"/>
-          <w:sz w:val="22"/>
-          <w:szCs w:val="22"/>
-        </w:rPr>
-        <w:t xml:space="preserve"> e + K</w:t>
-      </w:r>
-      <w:r>
-        <w:rPr>
-          <w:rFonts w:ascii="Cambria" w:cs="Cambria" w:eastAsia="Cambria" w:hAnsi="Cambria"/>
-          <w:color w:val="333333"/>
-          <w:sz w:val="22"/>
-          <w:szCs w:val="22"/>
-          <w:vertAlign w:val="subscript"/>
-        </w:rPr>
-        <w:t xml:space="preserve">d</w:t>
-      </w:r>
-      <w:r>
-        <w:rPr>
-          <w:rFonts w:ascii="Cambria" w:cs="Cambria" w:eastAsia="Cambria" w:hAnsi="Cambria"/>
-          <w:color w:val="333333"/>
-          <w:sz w:val="22"/>
-          <w:szCs w:val="22"/>
-        </w:rPr>
-        <w:t xml:space="preserve"> ė gives the denominator s² + K</w:t>
-      </w:r>
-      <w:r>
-        <w:rPr>
-          <w:rFonts w:ascii="Cambria" w:cs="Cambria" w:eastAsia="Cambria" w:hAnsi="Cambria"/>
-          <w:color w:val="333333"/>
-          <w:sz w:val="22"/>
-          <w:szCs w:val="22"/>
-          <w:vertAlign w:val="subscript"/>
-        </w:rPr>
-        <w:t xml:space="preserve">d</w:t>
-      </w:r>
-      <w:r>
-        <w:rPr>
-          <w:rFonts w:ascii="Cambria" w:cs="Cambria" w:eastAsia="Cambria" w:hAnsi="Cambria"/>
-          <w:color w:val="333333"/>
-          <w:sz w:val="22"/>
-          <w:szCs w:val="22"/>
-        </w:rPr>
-        <w:t xml:space="preserve"> s + K</w:t>
-      </w:r>
-      <w:r>
-        <w:rPr>
-          <w:rFonts w:ascii="Cambria" w:cs="Cambria" w:eastAsia="Cambria" w:hAnsi="Cambria"/>
-          <w:color w:val="333333"/>
-          <w:sz w:val="22"/>
-          <w:szCs w:val="22"/>
-          <w:vertAlign w:val="subscript"/>
-        </w:rPr>
-        <w:t xml:space="preserve">p</w:t>
-      </w:r>
-      <w:r>
-        <w:rPr>
-          <w:rFonts w:ascii="Cambria" w:cs="Cambria" w:eastAsia="Cambria" w:hAnsi="Cambria"/>
-          <w:color w:val="333333"/>
-          <w:sz w:val="22"/>
-          <w:szCs w:val="22"/>
-        </w:rPr>
-        <w:t xml:space="preserve"> on every axis.</w:t>
-      </w:r>
-    </w:p>
-    <w:p>
-      <w:pPr>
-        <w:keepNext w:val="false"/>
-        <w:spacing w:after="140" w:before="0" w:line="276"/>
-        <w:jc w:val="left"/>
-      </w:pPr>
-      <w:r>
-        <w:rPr>
-          <w:rFonts w:ascii="Cambria" w:cs="Cambria" w:eastAsia="Cambria" w:hAnsi="Cambria"/>
-          <w:color w:val="333333"/>
-          <w:sz w:val="22"/>
-          <w:szCs w:val="22"/>
-        </w:rPr>
-        <w:t xml:space="preserve">This PD command is the gains box of the notes' Figure 3. K</w:t>
-      </w:r>
-      <w:r>
-        <w:rPr>
-          <w:rFonts w:ascii="Cambria" w:cs="Cambria" w:eastAsia="Cambria" w:hAnsi="Cambria"/>
-          <w:color w:val="333333"/>
-          <w:sz w:val="22"/>
-          <w:szCs w:val="22"/>
-          <w:vertAlign w:val="subscript"/>
-        </w:rPr>
-        <w:t xml:space="preserve">p</w:t>
-      </w:r>
-      <w:r>
-        <w:rPr>
-          <w:rFonts w:ascii="Cambria" w:cs="Cambria" w:eastAsia="Cambria" w:hAnsi="Cambria"/>
-          <w:color w:val="333333"/>
-          <w:sz w:val="22"/>
-          <w:szCs w:val="22"/>
-        </w:rPr>
-        <w:t xml:space="preserve"> multiplies the position error e</w:t>
-      </w:r>
-      <w:r>
-        <w:rPr>
-          <w:rFonts w:ascii="Cambria" w:cs="Cambria" w:eastAsia="Cambria" w:hAnsi="Cambria"/>
-          <w:color w:val="333333"/>
-          <w:sz w:val="22"/>
-          <w:szCs w:val="22"/>
-          <w:vertAlign w:val="subscript"/>
-        </w:rPr>
-        <w:t xml:space="preserve">k</w:t>
-      </w:r>
-      <w:r>
-        <w:rPr>
-          <w:rFonts w:ascii="Cambria" w:cs="Cambria" w:eastAsia="Cambria" w:hAnsi="Cambria"/>
-          <w:color w:val="333333"/>
-          <w:sz w:val="22"/>
-          <w:szCs w:val="22"/>
-        </w:rPr>
-        <w:t xml:space="preserve">, between the plan and the latest sample, and K</w:t>
-      </w:r>
-      <w:r>
-        <w:rPr>
-          <w:rFonts w:ascii="Cambria" w:cs="Cambria" w:eastAsia="Cambria" w:hAnsi="Cambria"/>
-          <w:color w:val="333333"/>
-          <w:sz w:val="22"/>
-          <w:szCs w:val="22"/>
-          <w:vertAlign w:val="subscript"/>
-        </w:rPr>
-        <w:t xml:space="preserve">d</w:t>
-      </w:r>
-      <w:r>
-        <w:rPr>
-          <w:rFonts w:ascii="Cambria" w:cs="Cambria" w:eastAsia="Cambria" w:hAnsi="Cambria"/>
-          <w:color w:val="333333"/>
-          <w:sz w:val="22"/>
-          <w:szCs w:val="22"/>
-        </w:rPr>
-        <w:t xml:space="preserve"> multiplies its rate ė</w:t>
-      </w:r>
-      <w:r>
-        <w:rPr>
-          <w:rFonts w:ascii="Cambria" w:cs="Cambria" w:eastAsia="Cambria" w:hAnsi="Cambria"/>
-          <w:color w:val="333333"/>
-          <w:sz w:val="22"/>
-          <w:szCs w:val="22"/>
-          <w:vertAlign w:val="subscript"/>
-        </w:rPr>
-        <w:t xml:space="preserve">k</w:t>
-      </w:r>
-      <w:r>
-        <w:rPr>
-          <w:rFonts w:ascii="Cambria" w:cs="Cambria" w:eastAsia="Cambria" w:hAnsi="Cambria"/>
-          <w:color w:val="333333"/>
-          <w:sz w:val="22"/>
-          <w:szCs w:val="22"/>
-        </w:rPr>
-        <w:t xml:space="preserve">. The PD term only corrects the reach; Week 6's feedforward torque still drives it, along the top row of that figure.</w:t>
-      </w:r>
-    </w:p>
-    <w:p>
-      <w:pPr>
-        <w:keepNext w:val="false"/>
-        <w:spacing w:after="140" w:before="0" w:line="276"/>
-        <w:jc w:val="left"/>
-      </w:pPr>
-      <w:r>
-        <w:rPr>
-          <w:rFonts w:ascii="Cambria" w:cs="Cambria" w:eastAsia="Cambria" w:hAnsi="Cambria"/>
-          <w:color w:val="333333"/>
-          <w:sz w:val="22"/>
-          <w:szCs w:val="22"/>
-        </w:rPr>
-        <w:t xml:space="preserve">Two differences from the cart. The output is an acceleration, so the gains are per unit mass: K</w:t>
-      </w:r>
-      <w:r>
-        <w:rPr>
-          <w:rFonts w:ascii="Cambria" w:cs="Cambria" w:eastAsia="Cambria" w:hAnsi="Cambria"/>
-          <w:color w:val="333333"/>
-          <w:sz w:val="22"/>
-          <w:szCs w:val="22"/>
-          <w:vertAlign w:val="subscript"/>
-        </w:rPr>
-        <w:t xml:space="preserve">p</w:t>
-      </w:r>
-      <w:r>
-        <w:rPr>
-          <w:rFonts w:ascii="Cambria" w:cs="Cambria" w:eastAsia="Cambria" w:hAnsi="Cambria"/>
-          <w:color w:val="333333"/>
-          <w:sz w:val="22"/>
-          <w:szCs w:val="22"/>
-        </w:rPr>
-        <w:t xml:space="preserve"> in 1/s² and K</w:t>
-      </w:r>
-      <w:r>
-        <w:rPr>
-          <w:rFonts w:ascii="Cambria" w:cs="Cambria" w:eastAsia="Cambria" w:hAnsi="Cambria"/>
-          <w:color w:val="333333"/>
-          <w:sz w:val="22"/>
-          <w:szCs w:val="22"/>
-          <w:vertAlign w:val="subscript"/>
-        </w:rPr>
-        <w:t xml:space="preserve">d</w:t>
-      </w:r>
-      <w:r>
-        <w:rPr>
-          <w:rFonts w:ascii="Cambria" w:cs="Cambria" w:eastAsia="Cambria" w:hAnsi="Cambria"/>
-          <w:color w:val="333333"/>
-          <w:sz w:val="22"/>
-          <w:szCs w:val="22"/>
-        </w:rPr>
-        <w:t xml:space="preserve"> in 1/s, where the cart's were in N/m and N s/m. And vision reports only positions, so ė</w:t>
-      </w:r>
-      <w:r>
-        <w:rPr>
-          <w:rFonts w:ascii="Cambria" w:cs="Cambria" w:eastAsia="Cambria" w:hAnsi="Cambria"/>
-          <w:color w:val="333333"/>
-          <w:sz w:val="22"/>
-          <w:szCs w:val="22"/>
-          <w:vertAlign w:val="subscript"/>
-        </w:rPr>
-        <w:t xml:space="preserve">k</w:t>
-      </w:r>
-      <w:r>
-        <w:rPr>
-          <w:rFonts w:ascii="Cambria" w:cs="Cambria" w:eastAsia="Cambria" w:hAnsi="Cambria"/>
-          <w:color w:val="333333"/>
-          <w:sz w:val="22"/>
-          <w:szCs w:val="22"/>
-        </w:rPr>
-        <w:t xml:space="preserve"> is not a true derivative: it is the difference of two samples divided by T</w:t>
-      </w:r>
-      <w:r>
-        <w:rPr>
-          <w:rFonts w:ascii="Cambria" w:cs="Cambria" w:eastAsia="Cambria" w:hAnsi="Cambria"/>
-          <w:color w:val="333333"/>
-          <w:sz w:val="22"/>
-          <w:szCs w:val="22"/>
-          <w:vertAlign w:val="subscript"/>
-        </w:rPr>
-        <w:t xml:space="preserve">S</w:t>
-      </w:r>
-      <w:r>
-        <w:rPr>
-          <w:rFonts w:ascii="Cambria" w:cs="Cambria" w:eastAsia="Cambria" w:hAnsi="Cambria"/>
-          <w:color w:val="333333"/>
-          <w:sz w:val="22"/>
-          <w:szCs w:val="22"/>
-        </w:rPr>
-        <w:t xml:space="preserve"> (notes Equation 8.8).</w:t>
-      </w:r>
-    </w:p>
-    <w:p>
-      <w:pPr>
-        <w:keepNext w:val="false"/>
-        <w:spacing w:after="140" w:before="0" w:line="276"/>
-        <w:jc w:val="left"/>
-      </w:pPr>
-      <w:r>
-        <w:rPr>
-          <w:rFonts w:ascii="Cambria" w:cs="Cambria" w:eastAsia="Cambria" w:hAnsi="Cambria"/>
-          <w:color w:val="333333"/>
-          <w:sz w:val="22"/>
-          <w:szCs w:val="22"/>
-        </w:rPr>
-        <w:t xml:space="preserve">The hand needs no integral term to reach a still target. G(s) = 1/s² is infinite at s = 0, so Equation H.12 gives e(∞) = 0 with PD control alone. The cart needed the integral term because its spring holds it short of the target unless the controller keeps pushing.</w:t>
-      </w:r>
-    </w:p>
-    <w:tbl>
-      <w:tblPr>
-        <w:tblW w:type="dxa" w:w="9360"/>
-        <w:tblBorders>
-          <w:top w:val="none"/>
-          <w:left w:val="none"/>
-          <w:bottom w:val="none"/>
-          <w:right w:val="none"/>
-          <w:insideH w:val="none"/>
-          <w:insideV w:val="none"/>
-        </w:tblBorders>
-      </w:tblPr>
-      <w:tblGrid>
-        <w:gridCol w:w="9360"/>
-      </w:tblGrid>
-      <w:tr>
-        <w:trPr>
-          <w:cantSplit/>
-        </w:trPr>
-        <w:tc>
-          <w:tcPr>
-            <w:tcW w:type="dxa" w:w="9360"/>
-            <w:tcBorders>
-              <w:top w:val="none" w:color="FFFFFF" w:sz="0"/>
-              <w:left w:val="none" w:color="FFFFFF" w:sz="0"/>
-              <w:bottom w:val="none" w:color="FFFFFF" w:sz="0"/>
-              <w:right w:val="none" w:color="FFFFFF" w:sz="0"/>
-            </w:tcBorders>
-            <w:shd w:fill="E8F1F8" w:color="auto" w:val="clear"/>
-            <w:tcMar>
-              <w:top w:type="dxa" w:w="150"/>
-              <w:left w:type="dxa" w:w="200"/>
-              <w:bottom w:type="dxa" w:w="40"/>
-              <w:right w:type="dxa" w:w="200"/>
-            </w:tcMar>
-          </w:tcPr>
-          <w:p>
-            <w:pPr>
-              <w:keepNext/>
-              <w:spacing w:after="80"/>
-            </w:pPr>
-            <w:r>
-              <w:rPr>
-                <w:rFonts w:ascii="Georgia" w:cs="Georgia" w:eastAsia="Georgia" w:hAnsi="Georgia"/>
-                <w:b/>
-                <w:bCs/>
-                <w:color w:val="1B2A4A"/>
-                <w:sz w:val="22"/>
-                <w:szCs w:val="22"/>
-              </w:rPr>
-              <w:t xml:space="preserve">On the board</w:t>
-            </w:r>
-          </w:p>
-        </w:tc>
-      </w:tr>
-      <w:tr>
-        <w:trPr>
-          <w:cantSplit/>
-        </w:trPr>
-        <w:tc>
-          <w:tcPr>
-            <w:tcW w:type="dxa" w:w="9360"/>
-            <w:tcBorders>
-              <w:top w:val="none" w:color="FFFFFF" w:sz="0"/>
-              <w:left w:val="none" w:color="FFFFFF" w:sz="0"/>
-              <w:bottom w:val="none" w:color="FFFFFF" w:sz="0"/>
-              <w:right w:val="none" w:color="FFFFFF" w:sz="0"/>
-            </w:tcBorders>
-            <w:shd w:fill="E8F1F8" w:color="auto" w:val="clear"/>
-            <w:tcMar>
-              <w:top w:type="dxa" w:w="0"/>
-              <w:left w:type="dxa" w:w="200"/>
-              <w:bottom w:type="dxa" w:w="40"/>
-              <w:right w:type="dxa" w:w="200"/>
-            </w:tcMar>
-          </w:tcPr>
-          <w:p>
-            <w:pPr>
-              <w:keepNext/>
-              <w:spacing w:after="100" w:line="264"/>
-            </w:pPr>
-            <w:r>
-              <w:rPr>
-                <w:rFonts w:ascii="Cambria" w:cs="Cambria" w:eastAsia="Cambria" w:hAnsi="Cambria"/>
-                <w:color w:val="333333"/>
-                <w:sz w:val="21"/>
-                <w:szCs w:val="21"/>
-              </w:rPr>
-              <w:t xml:space="preserve">hand = a mass, no spring, no damper:    m ẍ = F    ⇒    G(s) = 1/(m s²)</w:t>
-            </w:r>
-          </w:p>
-        </w:tc>
-      </w:tr>
-      <w:tr>
-        <w:trPr>
-          <w:cantSplit/>
-        </w:trPr>
-        <w:tc>
-          <w:tcPr>
-            <w:tcW w:type="dxa" w:w="9360"/>
-            <w:tcBorders>
-              <w:top w:val="none" w:color="FFFFFF" w:sz="0"/>
-              <w:left w:val="none" w:color="FFFFFF" w:sz="0"/>
-              <w:bottom w:val="none" w:color="FFFFFF" w:sz="0"/>
-              <w:right w:val="none" w:color="FFFFFF" w:sz="0"/>
-            </w:tcBorders>
-            <w:shd w:fill="E8F1F8" w:color="auto" w:val="clear"/>
-            <w:tcMar>
-              <w:top w:type="dxa" w:w="0"/>
-              <w:left w:type="dxa" w:w="200"/>
-              <w:bottom w:type="dxa" w:w="40"/>
-              <w:right w:type="dxa" w:w="200"/>
-            </w:tcMar>
-          </w:tcPr>
-          <w:p>
-            <w:pPr>
-              <w:keepNext/>
-              <w:spacing w:after="100" w:line="264"/>
-            </w:pPr>
-            <w:r>
-              <w:rPr>
-                <w:rFonts w:ascii="Cambria" w:cs="Cambria" w:eastAsia="Cambria" w:hAnsi="Cambria"/>
-                <w:color w:val="333333"/>
-                <w:sz w:val="21"/>
-                <w:szCs w:val="21"/>
-              </w:rPr>
-              <w:t xml:space="preserve">force PD:  m s² + D s + K   ⇒   ω</w:t>
-            </w:r>
-            <w:r>
-              <w:rPr>
-                <w:rFonts w:ascii="Cambria" w:cs="Cambria" w:eastAsia="Cambria" w:hAnsi="Cambria"/>
-                <w:color w:val="333333"/>
-                <w:sz w:val="21"/>
-                <w:szCs w:val="21"/>
-                <w:vertAlign w:val="subscript"/>
-              </w:rPr>
-              <w:t xml:space="preserve">n</w:t>
-            </w:r>
-            <w:r>
-              <w:rPr>
-                <w:rFonts w:ascii="Cambria" w:cs="Cambria" w:eastAsia="Cambria" w:hAnsi="Cambria"/>
-                <w:color w:val="333333"/>
-                <w:sz w:val="21"/>
-                <w:szCs w:val="21"/>
-              </w:rPr>
-              <w:t xml:space="preserve"> = √(K/m),  ζ = D/(2√(K m));   m = 0.30 or 2.09 kg</w:t>
-            </w:r>
-          </w:p>
-        </w:tc>
-      </w:tr>
-      <w:tr>
-        <w:trPr>
-          <w:cantSplit/>
-        </w:trPr>
-        <w:tc>
-          <w:tcPr>
-            <w:tcW w:type="dxa" w:w="9360"/>
-            <w:tcBorders>
-              <w:top w:val="none" w:color="FFFFFF" w:sz="0"/>
-              <w:left w:val="none" w:color="FFFFFF" w:sz="0"/>
-              <w:bottom w:val="none" w:color="FFFFFF" w:sz="0"/>
-              <w:right w:val="none" w:color="FFFFFF" w:sz="0"/>
-            </w:tcBorders>
-            <w:shd w:fill="E8F1F8" w:color="auto" w:val="clear"/>
-            <w:tcMar>
-              <w:top w:type="dxa" w:w="0"/>
-              <w:left w:type="dxa" w:w="200"/>
-              <w:bottom w:type="dxa" w:w="40"/>
-              <w:right w:type="dxa" w:w="200"/>
-            </w:tcMar>
-          </w:tcPr>
-          <w:p>
-            <w:pPr>
-              <w:keepNext/>
-              <w:spacing w:after="100" w:line="264"/>
-            </w:pPr>
-            <w:r>
-              <w:rPr>
-                <w:rFonts w:ascii="Cambria" w:cs="Cambria" w:eastAsia="Cambria" w:hAnsi="Cambria"/>
-                <w:color w:val="333333"/>
-                <w:sz w:val="21"/>
-                <w:szCs w:val="21"/>
-              </w:rPr>
-              <w:t xml:space="preserve">acceleration PD (Week 6, τ = M J</w:t>
-            </w:r>
-            <w:r>
-              <w:rPr>
-                <w:rFonts w:ascii="Cambria" w:cs="Cambria" w:eastAsia="Cambria" w:hAnsi="Cambria"/>
-                <w:color w:val="333333"/>
-                <w:sz w:val="21"/>
-                <w:szCs w:val="21"/>
-                <w:vertAlign w:val="superscript"/>
-              </w:rPr>
-              <w:t xml:space="preserve">−1</w:t>
-            </w:r>
-            <w:r>
-              <w:rPr>
-                <w:rFonts w:ascii="Cambria" w:cs="Cambria" w:eastAsia="Cambria" w:hAnsi="Cambria"/>
-                <w:color w:val="333333"/>
-                <w:sz w:val="21"/>
-                <w:szCs w:val="21"/>
-              </w:rPr>
-              <w:t xml:space="preserve"> a):   s² + K</w:t>
-            </w:r>
-            <w:r>
-              <w:rPr>
-                <w:rFonts w:ascii="Cambria" w:cs="Cambria" w:eastAsia="Cambria" w:hAnsi="Cambria"/>
-                <w:color w:val="333333"/>
-                <w:sz w:val="21"/>
-                <w:szCs w:val="21"/>
-                <w:vertAlign w:val="subscript"/>
-              </w:rPr>
-              <w:t xml:space="preserve">d</w:t>
-            </w:r>
-            <w:r>
-              <w:rPr>
-                <w:rFonts w:ascii="Cambria" w:cs="Cambria" w:eastAsia="Cambria" w:hAnsi="Cambria"/>
-                <w:color w:val="333333"/>
-                <w:sz w:val="21"/>
-                <w:szCs w:val="21"/>
-              </w:rPr>
-              <w:t xml:space="preserve"> s + K</w:t>
-            </w:r>
-            <w:r>
-              <w:rPr>
-                <w:rFonts w:ascii="Cambria" w:cs="Cambria" w:eastAsia="Cambria" w:hAnsi="Cambria"/>
-                <w:color w:val="333333"/>
-                <w:sz w:val="21"/>
-                <w:szCs w:val="21"/>
-                <w:vertAlign w:val="subscript"/>
-              </w:rPr>
-              <w:t xml:space="preserve">p</w:t>
-            </w:r>
-            <w:r>
-              <w:rPr>
-                <w:rFonts w:ascii="Cambria" w:cs="Cambria" w:eastAsia="Cambria" w:hAnsi="Cambria"/>
-                <w:color w:val="333333"/>
-                <w:sz w:val="21"/>
-                <w:szCs w:val="21"/>
-              </w:rPr>
-              <w:t xml:space="preserve">   on every axis</w:t>
-            </w:r>
-          </w:p>
-        </w:tc>
-      </w:tr>
-      <w:tr>
-        <w:trPr>
-          <w:cantSplit/>
-        </w:trPr>
-        <w:tc>
-          <w:tcPr>
-            <w:tcW w:type="dxa" w:w="9360"/>
-            <w:tcBorders>
-              <w:top w:val="none" w:color="FFFFFF" w:sz="0"/>
-              <w:left w:val="none" w:color="FFFFFF" w:sz="0"/>
-              <w:bottom w:val="none" w:color="FFFFFF" w:sz="0"/>
-              <w:right w:val="none" w:color="FFFFFF" w:sz="0"/>
-            </w:tcBorders>
-            <w:shd w:fill="E8F1F8" w:color="auto" w:val="clear"/>
-            <w:tcMar>
-              <w:top w:type="dxa" w:w="0"/>
-              <w:left w:type="dxa" w:w="200"/>
-              <w:bottom w:type="dxa" w:w="150"/>
-              <w:right w:type="dxa" w:w="200"/>
-            </w:tcMar>
-          </w:tcPr>
-          <w:p>
-            <w:pPr>
-              <w:keepNext w:val="false"/>
-              <w:spacing w:after="100" w:line="264"/>
-            </w:pPr>
-            <w:r>
-              <w:rPr>
-                <w:rFonts w:ascii="Cambria" w:cs="Cambria" w:eastAsia="Cambria" w:hAnsi="Cambria"/>
-                <w:color w:val="333333"/>
-                <w:sz w:val="21"/>
-                <w:szCs w:val="21"/>
-              </w:rPr>
-              <w:t xml:space="preserve">G(0) = ∞   ⇒   e(∞) = 1/(1 + C(0) G(0)) = 0   without an integral term</w:t>
-            </w:r>
-          </w:p>
-        </w:tc>
-      </w:tr>
-    </w:tbl>
-    <w:p>
-      <w:pPr>
-        <w:spacing w:after="120"/>
-      </w:pPr>
-    </w:p>
-    <w:p>
-      <w:pPr>
-        <w:keepNext w:val="false"/>
-        <w:spacing w:after="140" w:before="0" w:line="276"/>
-        <w:jc w:val="left"/>
-      </w:pPr>
-      <w:r>
-        <w:rPr>
-          <w:rFonts w:ascii="Cambria" w:cs="Cambria" w:eastAsia="Cambria" w:hAnsi="Cambria"/>
-          <w:b/>
-          <w:bCs/>
-          <w:color w:val="333333"/>
-          <w:sz w:val="22"/>
-          <w:szCs w:val="22"/>
-        </w:rPr>
-        <w:t xml:space="preserve">In the pre-lab and Lab 08.</w:t>
-      </w:r>
-      <w:r>
-        <w:rPr>
-          <w:rFonts w:ascii="Cambria" w:cs="Cambria" w:eastAsia="Cambria" w:hAnsi="Cambria"/>
-          <w:color w:val="333333"/>
-          <w:sz w:val="22"/>
-          <w:szCs w:val="22"/>
-        </w:rPr>
-        <w:t xml:space="preserve"> Pre-lab Task P.3 gives the hand Lab 08's gains without the delay. Lab 08's Task C.1 builds the same controller on the two-joint arm, and Task C.6 turns its gains into a stiffness, m K</w:t>
-      </w:r>
-      <w:r>
-        <w:rPr>
-          <w:rFonts w:ascii="Cambria" w:cs="Cambria" w:eastAsia="Cambria" w:hAnsi="Cambria"/>
-          <w:color w:val="333333"/>
-          <w:sz w:val="22"/>
-          <w:szCs w:val="22"/>
-          <w:vertAlign w:val="subscript"/>
-        </w:rPr>
-        <w:t xml:space="preserve">p</w:t>
-      </w:r>
-      <w:r>
-        <w:rPr>
-          <w:rFonts w:ascii="Cambria" w:cs="Cambria" w:eastAsia="Cambria" w:hAnsi="Cambria"/>
-          <w:color w:val="333333"/>
-          <w:sz w:val="22"/>
-          <w:szCs w:val="22"/>
-        </w:rPr>
-        <w:t xml:space="preserve">.</w:t>
-      </w:r>
-    </w:p>
-    <w:p>
-      <w:pPr>
-        <w:spacing w:after="160" w:before="60" w:line="276"/>
-        <w:ind w:left="360"/>
+        <w:t xml:space="preserve">Both poles of G sit at s = 0. A push accelerates the hand, and nothing pulls it back. G(0) = 1/(m × 0) is infinite, which Step 4 uses.</w:t>
+      </w:r>
+    </w:p>
+    <w:p>
+      <w:pPr>
+        <w:keepNext/>
+        <w:spacing w:after="130" w:before="280"/>
       </w:pPr>
       <w:r>
         <w:rPr>
@@ -13756,43 +13124,15 @@
           <w:b/>
           <w:bCs/>
           <w:color w:val="2E86AB"/>
-          <w:sz w:val="21"/>
-          <w:szCs w:val="21"/>
-        </w:rPr>
-        <w:t xml:space="preserve">Check 10. </w:t>
-      </w:r>
-      <w:r>
-        <w:rPr>
-          <w:rFonts w:ascii="Cambria" w:cs="Cambria" w:eastAsia="Cambria" w:hAnsi="Cambria"/>
-          <w:i/>
-          <w:iCs/>
-          <w:color w:val="333333"/>
-          <w:sz w:val="21"/>
-          <w:szCs w:val="21"/>
-        </w:rPr>
-        <w:t xml:space="preserve">With the force command and K = 10 N/m, which D gives the heavy axis ζ = 0.7? What is ζ on the light axis then?</w:t>
+          <w:sz w:val="26"/>
+          <w:szCs w:val="26"/>
+        </w:rPr>
+        <w:t xml:space="preserve">Step 2. The loop</w:t>
       </w:r>
     </w:p>
     <w:p>
       <w:pPr>
         <w:keepNext/>
-        <w:spacing w:after="160" w:before="340"/>
-      </w:pPr>
-      <w:r>
-        <w:rPr>
-          <w:rFonts w:ascii="Georgia" w:cs="Georgia" w:eastAsia="Georgia" w:hAnsi="Georgia"/>
-          <w:b/>
-          <w:bCs/>
-          <w:color w:val="1B2A4A"/>
-          <w:sz w:val="32"/>
-          <w:szCs w:val="32"/>
-        </w:rPr>
-        <w:t xml:space="preserve">Board 11. The Hand With a Delay</w:t>
-      </w:r>
-    </w:p>
-    <w:p>
-      <w:pPr>
-        <w:keepNext w:val="false"/>
         <w:spacing w:after="140" w:before="0" w:line="276"/>
         <w:jc w:val="left"/>
       </w:pPr>
@@ -13803,26 +13143,26 @@
           <w:sz w:val="22"/>
           <w:szCs w:val="22"/>
         </w:rPr>
-        <w:t xml:space="preserve">Vision reports the hand Δ late (notes Equation 8.1), so the controller acts on e(t − Δ). By Equation H.7, the delay multiplies the correction by e</w:t>
-      </w:r>
-      <w:r>
-        <w:rPr>
-          <w:rFonts w:ascii="Cambria" w:cs="Cambria" w:eastAsia="Cambria" w:hAnsi="Cambria"/>
-          <w:color w:val="333333"/>
-          <w:sz w:val="22"/>
-          <w:szCs w:val="22"/>
-          <w:vertAlign w:val="superscript"/>
-        </w:rPr>
-        <w:t xml:space="preserve">−sΔ</w:t>
-      </w:r>
-      <w:r>
-        <w:rPr>
-          <w:rFonts w:ascii="Cambria" w:cs="Cambria" w:eastAsia="Cambria" w:hAnsi="Cambria"/>
-          <w:color w:val="333333"/>
-          <w:sz w:val="22"/>
-          <w:szCs w:val="22"/>
-        </w:rPr>
-        <w:t xml:space="preserve">, and the denominator of the loop becomes</w:t>
+        <w:t xml:space="preserve">As for the cart, a controller compares the hand's position x with a target r and sets the force from the error (Figure 7A). The loop is Board 5's three equations: E = R − X, F = C(s) E and X = G(s) F. The controller is PD, Equation H.14 with K</w:t>
+      </w:r>
+      <w:r>
+        <w:rPr>
+          <w:rFonts w:ascii="Cambria" w:cs="Cambria" w:eastAsia="Cambria" w:hAnsi="Cambria"/>
+          <w:color w:val="333333"/>
+          <w:sz w:val="22"/>
+          <w:szCs w:val="22"/>
+          <w:vertAlign w:val="subscript"/>
+        </w:rPr>
+        <w:t xml:space="preserve">i</w:t>
+      </w:r>
+      <w:r>
+        <w:rPr>
+          <w:rFonts w:ascii="Cambria" w:cs="Cambria" w:eastAsia="Cambria" w:hAnsi="Cambria"/>
+          <w:color w:val="333333"/>
+          <w:sz w:val="22"/>
+          <w:szCs w:val="22"/>
+        </w:rPr>
+        <w:t xml:space="preserve"> = 0:</w:t>
       </w:r>
     </w:p>
     <w:p>
@@ -13840,64 +13180,7 @@
           <w:sz w:val="24"/>
           <w:szCs w:val="24"/>
         </w:rPr>
-        <w:t xml:space="preserve">s²  +  (K</w:t>
-      </w:r>
-      <w:r>
-        <w:rPr>
-          <w:rFonts w:ascii="Cambria" w:cs="Cambria" w:eastAsia="Cambria" w:hAnsi="Cambria"/>
-          <w:color w:val="333333"/>
-          <w:sz w:val="24"/>
-          <w:szCs w:val="24"/>
-          <w:vertAlign w:val="subscript"/>
-        </w:rPr>
-        <w:t xml:space="preserve">p</w:t>
-      </w:r>
-      <w:r>
-        <w:rPr>
-          <w:rFonts w:ascii="Cambria" w:cs="Cambria" w:eastAsia="Cambria" w:hAnsi="Cambria"/>
-          <w:color w:val="333333"/>
-          <w:sz w:val="24"/>
-          <w:szCs w:val="24"/>
-        </w:rPr>
-        <w:t xml:space="preserve"> + K</w:t>
-      </w:r>
-      <w:r>
-        <w:rPr>
-          <w:rFonts w:ascii="Cambria" w:cs="Cambria" w:eastAsia="Cambria" w:hAnsi="Cambria"/>
-          <w:color w:val="333333"/>
-          <w:sz w:val="24"/>
-          <w:szCs w:val="24"/>
-          <w:vertAlign w:val="subscript"/>
-        </w:rPr>
-        <w:t xml:space="preserve">d</w:t>
-      </w:r>
-      <w:r>
-        <w:rPr>
-          <w:rFonts w:ascii="Cambria" w:cs="Cambria" w:eastAsia="Cambria" w:hAnsi="Cambria"/>
-          <w:color w:val="333333"/>
-          <w:sz w:val="24"/>
-          <w:szCs w:val="24"/>
-        </w:rPr>
-        <w:t xml:space="preserve"> s) e</w:t>
-      </w:r>
-      <w:r>
-        <w:rPr>
-          <w:rFonts w:ascii="Cambria" w:cs="Cambria" w:eastAsia="Cambria" w:hAnsi="Cambria"/>
-          <w:color w:val="333333"/>
-          <w:sz w:val="24"/>
-          <w:szCs w:val="24"/>
-          <w:vertAlign w:val="superscript"/>
-        </w:rPr>
-        <w:t xml:space="preserve">−sΔ</w:t>
-      </w:r>
-      <w:r>
-        <w:rPr>
-          <w:rFonts w:ascii="Cambria" w:cs="Cambria" w:eastAsia="Cambria" w:hAnsi="Cambria"/>
-          <w:color w:val="333333"/>
-          <w:sz w:val="24"/>
-          <w:szCs w:val="24"/>
-        </w:rPr>
-        <w:t xml:space="preserve">  =  0</w:t>
+        <w:t xml:space="preserve">C(s)  =  K  +  D s</w:t>
       </w:r>
       <w:r>
         <w:rPr>
@@ -13923,280 +13206,7 @@
           <w:sz w:val="22"/>
           <w:szCs w:val="22"/>
         </w:rPr>
-        <w:t xml:space="preserve">This is the characteristic equation of the notes' Equation 8.4. For central vision the effective delay is Δ = 155 ms (notes §3.2). Equation H.20 is not a polynomial: e</w:t>
-      </w:r>
-      <w:r>
-        <w:rPr>
-          <w:rFonts w:ascii="Cambria" w:cs="Cambria" w:eastAsia="Cambria" w:hAnsi="Cambria"/>
-          <w:color w:val="333333"/>
-          <w:sz w:val="22"/>
-          <w:szCs w:val="22"/>
-          <w:vertAlign w:val="superscript"/>
-        </w:rPr>
-        <w:t xml:space="preserve">−sΔ</w:t>
-      </w:r>
-      <w:r>
-        <w:rPr>
-          <w:rFonts w:ascii="Cambria" w:cs="Cambria" w:eastAsia="Cambria" w:hAnsi="Cambria"/>
-          <w:color w:val="333333"/>
-          <w:sz w:val="22"/>
-          <w:szCs w:val="22"/>
-        </w:rPr>
-        <w:t xml:space="preserve"> gives it infinitely many roots, and the quadratic formula no longer applies. The root that matters most is the one nearest the vertical axis, the slowest (Board 4). The notes find it with the Lambert W function (Equation 8.5) or numerically.</w:t>
-      </w:r>
-    </w:p>
-    <w:p>
-      <w:pPr>
-        <w:keepNext w:val="false"/>
-        <w:spacing w:after="140" w:before="0" w:line="276"/>
-        <w:jc w:val="left"/>
-      </w:pPr>
-      <w:r>
-        <w:rPr>
-          <w:rFonts w:ascii="Cambria" w:cs="Cambria" w:eastAsia="Cambria" w:hAnsi="Cambria"/>
-          <w:color w:val="333333"/>
-          <w:sz w:val="22"/>
-          <w:szCs w:val="22"/>
-        </w:rPr>
-        <w:t xml:space="preserve">Take the gains of the notes' Figure 4, κ = K</w:t>
-      </w:r>
-      <w:r>
-        <w:rPr>
-          <w:rFonts w:ascii="Cambria" w:cs="Cambria" w:eastAsia="Cambria" w:hAnsi="Cambria"/>
-          <w:color w:val="333333"/>
-          <w:sz w:val="22"/>
-          <w:szCs w:val="22"/>
-          <w:vertAlign w:val="subscript"/>
-        </w:rPr>
-        <w:t xml:space="preserve">p</w:t>
-      </w:r>
-      <w:r>
-        <w:rPr>
-          <w:rFonts w:ascii="Cambria" w:cs="Cambria" w:eastAsia="Cambria" w:hAnsi="Cambria"/>
-          <w:color w:val="333333"/>
-          <w:sz w:val="22"/>
-          <w:szCs w:val="22"/>
-        </w:rPr>
-        <w:t xml:space="preserve">Δ² = 0.2 and δ = K</w:t>
-      </w:r>
-      <w:r>
-        <w:rPr>
-          <w:rFonts w:ascii="Cambria" w:cs="Cambria" w:eastAsia="Cambria" w:hAnsi="Cambria"/>
-          <w:color w:val="333333"/>
-          <w:sz w:val="22"/>
-          <w:szCs w:val="22"/>
-          <w:vertAlign w:val="subscript"/>
-        </w:rPr>
-        <w:t xml:space="preserve">d</w:t>
-      </w:r>
-      <w:r>
-        <w:rPr>
-          <w:rFonts w:ascii="Cambria" w:cs="Cambria" w:eastAsia="Cambria" w:hAnsi="Cambria"/>
-          <w:color w:val="333333"/>
-          <w:sz w:val="22"/>
-          <w:szCs w:val="22"/>
-        </w:rPr>
-        <w:t xml:space="preserve">Δ = 0.9, so K</w:t>
-      </w:r>
-      <w:r>
-        <w:rPr>
-          <w:rFonts w:ascii="Cambria" w:cs="Cambria" w:eastAsia="Cambria" w:hAnsi="Cambria"/>
-          <w:color w:val="333333"/>
-          <w:sz w:val="22"/>
-          <w:szCs w:val="22"/>
-          <w:vertAlign w:val="subscript"/>
-        </w:rPr>
-        <w:t xml:space="preserve">p</w:t>
-      </w:r>
-      <w:r>
-        <w:rPr>
-          <w:rFonts w:ascii="Cambria" w:cs="Cambria" w:eastAsia="Cambria" w:hAnsi="Cambria"/>
-          <w:color w:val="333333"/>
-          <w:sz w:val="22"/>
-          <w:szCs w:val="22"/>
-        </w:rPr>
-        <w:t xml:space="preserve"> = 8.3 s</w:t>
-      </w:r>
-      <w:r>
-        <w:rPr>
-          <w:rFonts w:ascii="Cambria" w:cs="Cambria" w:eastAsia="Cambria" w:hAnsi="Cambria"/>
-          <w:color w:val="333333"/>
-          <w:sz w:val="22"/>
-          <w:szCs w:val="22"/>
-          <w:vertAlign w:val="superscript"/>
-        </w:rPr>
-        <w:t xml:space="preserve">−2</w:t>
-      </w:r>
-      <w:r>
-        <w:rPr>
-          <w:rFonts w:ascii="Cambria" w:cs="Cambria" w:eastAsia="Cambria" w:hAnsi="Cambria"/>
-          <w:color w:val="333333"/>
-          <w:sz w:val="22"/>
-          <w:szCs w:val="22"/>
-        </w:rPr>
-        <w:t xml:space="preserve"> and K</w:t>
-      </w:r>
-      <w:r>
-        <w:rPr>
-          <w:rFonts w:ascii="Cambria" w:cs="Cambria" w:eastAsia="Cambria" w:hAnsi="Cambria"/>
-          <w:color w:val="333333"/>
-          <w:sz w:val="22"/>
-          <w:szCs w:val="22"/>
-          <w:vertAlign w:val="subscript"/>
-        </w:rPr>
-        <w:t xml:space="preserve">d</w:t>
-      </w:r>
-      <w:r>
-        <w:rPr>
-          <w:rFonts w:ascii="Cambria" w:cs="Cambria" w:eastAsia="Cambria" w:hAnsi="Cambria"/>
-          <w:color w:val="333333"/>
-          <w:sz w:val="22"/>
-          <w:szCs w:val="22"/>
-        </w:rPr>
-        <w:t xml:space="preserve"> = 5.8 s</w:t>
-      </w:r>
-      <w:r>
-        <w:rPr>
-          <w:rFonts w:ascii="Cambria" w:cs="Cambria" w:eastAsia="Cambria" w:hAnsi="Cambria"/>
-          <w:color w:val="333333"/>
-          <w:sz w:val="22"/>
-          <w:szCs w:val="22"/>
-          <w:vertAlign w:val="superscript"/>
-        </w:rPr>
-        <w:t xml:space="preserve">−1</w:t>
-      </w:r>
-      <w:r>
-        <w:rPr>
-          <w:rFonts w:ascii="Cambria" w:cs="Cambria" w:eastAsia="Cambria" w:hAnsi="Cambria"/>
-          <w:color w:val="333333"/>
-          <w:sz w:val="22"/>
-          <w:szCs w:val="22"/>
-        </w:rPr>
-        <w:t xml:space="preserve">. Without the delay, s² + 5.8 s + 8.3 has ζ = 1.01. From a 1 cm offset, the error falls smoothly to zero (Figure 7B).</w:t>
-      </w:r>
-    </w:p>
-    <w:p>
-      <w:pPr>
-        <w:keepNext w:val="false"/>
-        <w:spacing w:after="140" w:before="0" w:line="276"/>
-        <w:jc w:val="left"/>
-      </w:pPr>
-      <w:r>
-        <w:rPr>
-          <w:rFonts w:ascii="Cambria" w:cs="Cambria" w:eastAsia="Cambria" w:hAnsi="Cambria"/>
-          <w:color w:val="333333"/>
-          <w:sz w:val="22"/>
-          <w:szCs w:val="22"/>
-        </w:rPr>
-        <w:t xml:space="preserve">With the delay, the root nearest the vertical axis is −1.86 ± 7.29i: 1.2 swings per second, with a time constant of 0.54 s. The error falls faster at first, because the braking from the velocity term arrives late. It then stalls once every 2π/7.29 = 0.86 s, and shrinks by a factor e every 1/1.86 = 0.54 s (Figure 7B). The same root sets the swings of the notes' Figure 4B.</w:t>
-      </w:r>
-    </w:p>
-    <w:p>
-      <w:pPr>
-        <w:keepNext w:val="false"/>
-        <w:spacing w:after="140" w:before="0" w:line="276"/>
-        <w:jc w:val="left"/>
-      </w:pPr>
-      <w:r>
-        <w:rPr>
-          <w:rFonts w:ascii="Cambria" w:cs="Cambria" w:eastAsia="Cambria" w:hAnsi="Cambria"/>
-          <w:color w:val="333333"/>
-          <w:sz w:val="22"/>
-          <w:szCs w:val="22"/>
-        </w:rPr>
-        <w:t xml:space="preserve">Now raise the gains toward the edge of the notes' Equation 8.7, to κ = 0.5 and δ = 0.95. Without the delay, these gains give ζ = 0.67 and an overshoot of 6%. With the delay, the root moves to −0.22 ± 6.96i, close to the vertical axis (Figure 3E). Its time constant is 4.5 s, so the error swings across zero for about 18 s before the swings are down to 2% (Figure 7B).</w:t>
-      </w:r>
-    </w:p>
-    <w:p>
-      <w:pPr>
-        <w:keepNext w:val="false"/>
-        <w:spacing w:after="140" w:before="0" w:line="276"/>
-        <w:jc w:val="left"/>
-      </w:pPr>
-      <w:r>
-        <w:rPr>
-          <w:rFonts w:ascii="Cambria" w:cs="Cambria" w:eastAsia="Cambria" w:hAnsi="Cambria"/>
-          <w:color w:val="333333"/>
-          <w:sz w:val="22"/>
-          <w:szCs w:val="22"/>
-        </w:rPr>
-        <w:t xml:space="preserve">On the cart, a larger K</w:t>
-      </w:r>
-      <w:r>
-        <w:rPr>
-          <w:rFonts w:ascii="Cambria" w:cs="Cambria" w:eastAsia="Cambria" w:hAnsi="Cambria"/>
-          <w:color w:val="333333"/>
-          <w:sz w:val="22"/>
-          <w:szCs w:val="22"/>
-          <w:vertAlign w:val="subscript"/>
-        </w:rPr>
-        <w:t xml:space="preserve">p</w:t>
-      </w:r>
-      <w:r>
-        <w:rPr>
-          <w:rFonts w:ascii="Cambria" w:cs="Cambria" w:eastAsia="Cambria" w:hAnsi="Cambria"/>
-          <w:color w:val="333333"/>
-          <w:sz w:val="22"/>
-          <w:szCs w:val="22"/>
-        </w:rPr>
-        <w:t xml:space="preserve"> only added overshoot. Here the delay sets a limit, K</w:t>
-      </w:r>
-      <w:r>
-        <w:rPr>
-          <w:rFonts w:ascii="Cambria" w:cs="Cambria" w:eastAsia="Cambria" w:hAnsi="Cambria"/>
-          <w:color w:val="333333"/>
-          <w:sz w:val="22"/>
-          <w:szCs w:val="22"/>
-          <w:vertAlign w:val="subscript"/>
-        </w:rPr>
-        <w:t xml:space="preserve">p</w:t>
-      </w:r>
-      <w:r>
-        <w:rPr>
-          <w:rFonts w:ascii="Cambria" w:cs="Cambria" w:eastAsia="Cambria" w:hAnsi="Cambria"/>
-          <w:color w:val="333333"/>
-          <w:sz w:val="22"/>
-          <w:szCs w:val="22"/>
-        </w:rPr>
-        <w:t xml:space="preserve">Δ² &lt; 0.55 (notes Equation 8.7): K</w:t>
-      </w:r>
-      <w:r>
-        <w:rPr>
-          <w:rFonts w:ascii="Cambria" w:cs="Cambria" w:eastAsia="Cambria" w:hAnsi="Cambria"/>
-          <w:color w:val="333333"/>
-          <w:sz w:val="22"/>
-          <w:szCs w:val="22"/>
-          <w:vertAlign w:val="subscript"/>
-        </w:rPr>
-        <w:t xml:space="preserve">p</w:t>
-      </w:r>
-      <w:r>
-        <w:rPr>
-          <w:rFonts w:ascii="Cambria" w:cs="Cambria" w:eastAsia="Cambria" w:hAnsi="Cambria"/>
-          <w:color w:val="333333"/>
-          <w:sz w:val="22"/>
-          <w:szCs w:val="22"/>
-        </w:rPr>
-        <w:t xml:space="preserve"> &lt; 22.9 s</w:t>
-      </w:r>
-      <w:r>
-        <w:rPr>
-          <w:rFonts w:ascii="Cambria" w:cs="Cambria" w:eastAsia="Cambria" w:hAnsi="Cambria"/>
-          <w:color w:val="333333"/>
-          <w:sz w:val="22"/>
-          <w:szCs w:val="22"/>
-          <w:vertAlign w:val="superscript"/>
-        </w:rPr>
-        <w:t xml:space="preserve">−2</w:t>
-      </w:r>
-      <w:r>
-        <w:rPr>
-          <w:rFonts w:ascii="Cambria" w:cs="Cambria" w:eastAsia="Cambria" w:hAnsi="Cambria"/>
-          <w:color w:val="333333"/>
-          <w:sz w:val="22"/>
-          <w:szCs w:val="22"/>
-        </w:rPr>
-        <w:t xml:space="preserve"> at 155 ms.</w:t>
+        <w:t xml:space="preserve">K acts on the error like a spring, in N/m. D acts on its rate like a damper, in N s/m (Table 4).</w:t>
       </w:r>
     </w:p>
     <w:p>
@@ -14209,7 +13219,7 @@
       <w:r>
         <w:drawing>
           <wp:inline distT="0" distB="0" distL="0" distR="0">
-            <wp:extent cx="5715000" cy="2276475"/>
+            <wp:extent cx="5715000" cy="2533650"/>
             <wp:effectExtent t="0" r="0" b="0" l="0"/>
             <wp:docPr id="1" name="" descr="" title=""/>
             <wp:cNvGraphicFramePr>
@@ -14234,7 +13244,7 @@
                   <pic:spPr bwMode="auto">
                     <a:xfrm>
                       <a:off x="0" y="0"/>
-                      <a:ext cx="5715000" cy="2276475"/>
+                      <a:ext cx="5715000" cy="2533650"/>
                     </a:xfrm>
                     <a:prstGeom prst="rect">
                       <a:avLst/>
@@ -14271,7 +13281,1127 @@
           <w:sz w:val="19"/>
           <w:szCs w:val="19"/>
         </w:rPr>
-        <w:t xml:space="preserve">The hand, along one axis. A: a PD force command with K = 10 N/m and D = 2 N s/m, step to a target; the same gains act on the light and the heavy axis. B: a PD acceleration command (Week 6's inverse dynamics) from a 1 cm offset, with and without a 155 ms delay. κ = K</w:t>
+        <w:t xml:space="preserve">The two loops on the hand, drawn as Figure 4. A: a PD controller commands a force on the hand, a mass with no spring and no damper (Steps 1–6). B: the controller commands a hand acceleration a, and Week 6's inverse dynamics turns it into torque. Near a resting posture the arm then accelerates the hand by a, so the controller sees 1/s² in every direction (Step 7).</w:t>
+      </w:r>
+    </w:p>
+    <w:p>
+      <w:pPr>
+        <w:keepNext/>
+        <w:spacing w:after="130" w:before="280"/>
+      </w:pPr>
+      <w:r>
+        <w:rPr>
+          <w:rFonts w:ascii="Georgia" w:cs="Georgia" w:eastAsia="Georgia" w:hAnsi="Georgia"/>
+          <w:b/>
+          <w:bCs/>
+          <w:color w:val="2E86AB"/>
+          <w:sz w:val="26"/>
+          <w:szCs w:val="26"/>
+        </w:rPr>
+        <w:t xml:space="preserve">Step 3. The closed loop</w:t>
+      </w:r>
+    </w:p>
+    <w:p>
+      <w:pPr>
+        <w:keepNext/>
+        <w:spacing w:after="140" w:before="0" w:line="276"/>
+        <w:jc w:val="left"/>
+      </w:pPr>
+      <w:r>
+        <w:rPr>
+          <w:rFonts w:ascii="Cambria" w:cs="Cambria" w:eastAsia="Cambria" w:hAnsi="Cambria"/>
+          <w:color w:val="333333"/>
+          <w:sz w:val="22"/>
+          <w:szCs w:val="22"/>
+        </w:rPr>
+        <w:t xml:space="preserve">Substitute Equations H.19 and H.20 into Equation H.11, one piece at a time. The product is C G = (D s + K)/(m s²). Adding 1 gives 1 + C G = (m s² + D s + K)/(m s²). Dividing the first by the second, the m s² cancels:</w:t>
+      </w:r>
+    </w:p>
+    <w:p>
+      <w:pPr>
+        <w:tabs>
+          <w:tab w:val="right" w:pos="9026"/>
+        </w:tabs>
+        <w:spacing w:after="150" w:before="120"/>
+        <w:ind w:left="360"/>
+      </w:pPr>
+      <w:r>
+        <w:rPr>
+          <w:rFonts w:ascii="Cambria" w:cs="Cambria" w:eastAsia="Cambria" w:hAnsi="Cambria"/>
+          <w:color w:val="333333"/>
+          <w:sz w:val="24"/>
+          <w:szCs w:val="24"/>
+        </w:rPr>
+        <w:t xml:space="preserve">T(s)  =  X(s) / R(s)  =  (D s + K) / (m s² + D s + K)</w:t>
+      </w:r>
+      <w:r>
+        <w:rPr>
+          <w:rFonts w:ascii="Cambria" w:cs="Cambria" w:eastAsia="Cambria" w:hAnsi="Cambria"/>
+          <w:color w:val="666666"/>
+          <w:sz w:val="20"/>
+          <w:szCs w:val="20"/>
+        </w:rPr>
+        <w:t xml:space="preserve">	</w:t>
+        <w:t xml:space="preserve">(H.21)</w:t>
+      </w:r>
+    </w:p>
+    <w:p>
+      <w:pPr>
+        <w:keepNext w:val="false"/>
+        <w:spacing w:after="140" w:before="0" w:line="276"/>
+        <w:jc w:val="left"/>
+      </w:pPr>
+      <w:r>
+        <w:rPr>
+          <w:rFonts w:ascii="Cambria" w:cs="Cambria" w:eastAsia="Cambria" w:hAnsi="Cambria"/>
+          <w:color w:val="333333"/>
+          <w:sz w:val="22"/>
+          <w:szCs w:val="22"/>
+        </w:rPr>
+        <w:t xml:space="preserve">Equation H.21 is Board 7's PD loop, Equation H.16, with the cart's spring and damper removed and its mass written as m.</w:t>
+      </w:r>
+    </w:p>
+    <w:p>
+      <w:pPr>
+        <w:keepNext/>
+        <w:spacing w:after="130" w:before="280"/>
+      </w:pPr>
+      <w:r>
+        <w:rPr>
+          <w:rFonts w:ascii="Georgia" w:cs="Georgia" w:eastAsia="Georgia" w:hAnsi="Georgia"/>
+          <w:b/>
+          <w:bCs/>
+          <w:color w:val="2E86AB"/>
+          <w:sz w:val="26"/>
+          <w:szCs w:val="26"/>
+        </w:rPr>
+        <w:t xml:space="preserve">Step 4. The steady-state error</w:t>
+      </w:r>
+    </w:p>
+    <w:p>
+      <w:pPr>
+        <w:keepNext w:val="false"/>
+        <w:spacing w:after="140" w:before="0" w:line="276"/>
+        <w:jc w:val="left"/>
+      </w:pPr>
+      <w:r>
+        <w:rPr>
+          <w:rFonts w:ascii="Cambria" w:cs="Cambria" w:eastAsia="Cambria" w:hAnsi="Cambria"/>
+          <w:color w:val="333333"/>
+          <w:sz w:val="22"/>
+          <w:szCs w:val="22"/>
+        </w:rPr>
+        <w:t xml:space="preserve">For a step target, Equation H.12 needs C(0) G(0). Here C(0) = K, and G(0) is infinite (Step 1), so</w:t>
+      </w:r>
+    </w:p>
+    <w:p>
+      <w:pPr>
+        <w:tabs>
+          <w:tab w:val="right" w:pos="9026"/>
+        </w:tabs>
+        <w:spacing w:after="150" w:before="120"/>
+        <w:ind w:left="360"/>
+      </w:pPr>
+      <w:r>
+        <w:rPr>
+          <w:rFonts w:ascii="Cambria" w:cs="Cambria" w:eastAsia="Cambria" w:hAnsi="Cambria"/>
+          <w:color w:val="333333"/>
+          <w:sz w:val="24"/>
+          <w:szCs w:val="24"/>
+        </w:rPr>
+        <w:t xml:space="preserve">e(∞)  =  1 / (1 + C(0) G(0))  =  1 / (1 + ∞)  =  0</w:t>
+      </w:r>
+      <w:r>
+        <w:rPr>
+          <w:rFonts w:ascii="Cambria" w:cs="Cambria" w:eastAsia="Cambria" w:hAnsi="Cambria"/>
+          <w:color w:val="666666"/>
+          <w:sz w:val="20"/>
+          <w:szCs w:val="20"/>
+        </w:rPr>
+        <w:t xml:space="preserve">	</w:t>
+        <w:t xml:space="preserve">(H.22)</w:t>
+      </w:r>
+    </w:p>
+    <w:p>
+      <w:pPr>
+        <w:keepNext w:val="false"/>
+        <w:spacing w:after="140" w:before="0" w:line="276"/>
+        <w:jc w:val="left"/>
+      </w:pPr>
+      <w:r>
+        <w:rPr>
+          <w:rFonts w:ascii="Cambria" w:cs="Cambria" w:eastAsia="Cambria" w:hAnsi="Cambria"/>
+          <w:color w:val="333333"/>
+          <w:sz w:val="22"/>
+          <w:szCs w:val="22"/>
+        </w:rPr>
+        <w:t xml:space="preserve">Equivalently, T(0) = K/K = 1: the hand ends exactly at the target. The cart stopped short under P and PD control, because its spring pulled it back (Board 6). The hand has no spring, so it needs no integral term (Board 8).</w:t>
+      </w:r>
+    </w:p>
+    <w:p>
+      <w:pPr>
+        <w:keepNext/>
+        <w:spacing w:after="130" w:before="280"/>
+      </w:pPr>
+      <w:r>
+        <w:rPr>
+          <w:rFonts w:ascii="Georgia" w:cs="Georgia" w:eastAsia="Georgia" w:hAnsi="Georgia"/>
+          <w:b/>
+          <w:bCs/>
+          <w:color w:val="2E86AB"/>
+          <w:sz w:val="26"/>
+          <w:szCs w:val="26"/>
+        </w:rPr>
+        <w:t xml:space="preserve">Step 5. The poles</w:t>
+      </w:r>
+    </w:p>
+    <w:p>
+      <w:pPr>
+        <w:keepNext w:val="false"/>
+        <w:spacing w:after="140" w:before="0" w:line="276"/>
+        <w:jc w:val="left"/>
+      </w:pPr>
+      <w:r>
+        <w:rPr>
+          <w:rFonts w:ascii="Cambria" w:cs="Cambria" w:eastAsia="Cambria" w:hAnsi="Cambria"/>
+          <w:color w:val="333333"/>
+          <w:sz w:val="22"/>
+          <w:szCs w:val="22"/>
+        </w:rPr>
+        <w:t xml:space="preserve">The poles are the roots of the denominator of Equation H.21, m s² + D s + K = 0. Divide by m to get s² + (D/m) s + K/m = 0, and match it term by term with Board 6's form, s² + 2ζω</w:t>
+      </w:r>
+      <w:r>
+        <w:rPr>
+          <w:rFonts w:ascii="Cambria" w:cs="Cambria" w:eastAsia="Cambria" w:hAnsi="Cambria"/>
+          <w:color w:val="333333"/>
+          <w:sz w:val="22"/>
+          <w:szCs w:val="22"/>
+          <w:vertAlign w:val="subscript"/>
+        </w:rPr>
+        <w:t xml:space="preserve">n</w:t>
+      </w:r>
+      <w:r>
+        <w:rPr>
+          <w:rFonts w:ascii="Cambria" w:cs="Cambria" w:eastAsia="Cambria" w:hAnsi="Cambria"/>
+          <w:color w:val="333333"/>
+          <w:sz w:val="22"/>
+          <w:szCs w:val="22"/>
+        </w:rPr>
+        <w:t xml:space="preserve"> s + ω</w:t>
+      </w:r>
+      <w:r>
+        <w:rPr>
+          <w:rFonts w:ascii="Cambria" w:cs="Cambria" w:eastAsia="Cambria" w:hAnsi="Cambria"/>
+          <w:color w:val="333333"/>
+          <w:sz w:val="22"/>
+          <w:szCs w:val="22"/>
+          <w:vertAlign w:val="subscript"/>
+        </w:rPr>
+        <w:t xml:space="preserve">n</w:t>
+      </w:r>
+      <w:r>
+        <w:rPr>
+          <w:rFonts w:ascii="Cambria" w:cs="Cambria" w:eastAsia="Cambria" w:hAnsi="Cambria"/>
+          <w:color w:val="333333"/>
+          <w:sz w:val="22"/>
+          <w:szCs w:val="22"/>
+        </w:rPr>
+        <w:t xml:space="preserve">².</w:t>
+      </w:r>
+    </w:p>
+    <w:p>
+      <w:pPr>
+        <w:keepNext/>
+        <w:spacing w:after="140" w:before="0" w:line="276"/>
+        <w:jc w:val="left"/>
+      </w:pPr>
+      <w:r>
+        <w:rPr>
+          <w:rFonts w:ascii="Cambria" w:cs="Cambria" w:eastAsia="Cambria" w:hAnsi="Cambria"/>
+          <w:color w:val="333333"/>
+          <w:sz w:val="22"/>
+          <w:szCs w:val="22"/>
+        </w:rPr>
+        <w:t xml:space="preserve">The constant terms give ω</w:t>
+      </w:r>
+      <w:r>
+        <w:rPr>
+          <w:rFonts w:ascii="Cambria" w:cs="Cambria" w:eastAsia="Cambria" w:hAnsi="Cambria"/>
+          <w:color w:val="333333"/>
+          <w:sz w:val="22"/>
+          <w:szCs w:val="22"/>
+          <w:vertAlign w:val="subscript"/>
+        </w:rPr>
+        <w:t xml:space="preserve">n</w:t>
+      </w:r>
+      <w:r>
+        <w:rPr>
+          <w:rFonts w:ascii="Cambria" w:cs="Cambria" w:eastAsia="Cambria" w:hAnsi="Cambria"/>
+          <w:color w:val="333333"/>
+          <w:sz w:val="22"/>
+          <w:szCs w:val="22"/>
+        </w:rPr>
+        <w:t xml:space="preserve">² = K/m. The s terms give 2ζω</w:t>
+      </w:r>
+      <w:r>
+        <w:rPr>
+          <w:rFonts w:ascii="Cambria" w:cs="Cambria" w:eastAsia="Cambria" w:hAnsi="Cambria"/>
+          <w:color w:val="333333"/>
+          <w:sz w:val="22"/>
+          <w:szCs w:val="22"/>
+          <w:vertAlign w:val="subscript"/>
+        </w:rPr>
+        <w:t xml:space="preserve">n</w:t>
+      </w:r>
+      <w:r>
+        <w:rPr>
+          <w:rFonts w:ascii="Cambria" w:cs="Cambria" w:eastAsia="Cambria" w:hAnsi="Cambria"/>
+          <w:color w:val="333333"/>
+          <w:sz w:val="22"/>
+          <w:szCs w:val="22"/>
+        </w:rPr>
+        <w:t xml:space="preserve"> = D/m, so ζ = D/(2 m ω</w:t>
+      </w:r>
+      <w:r>
+        <w:rPr>
+          <w:rFonts w:ascii="Cambria" w:cs="Cambria" w:eastAsia="Cambria" w:hAnsi="Cambria"/>
+          <w:color w:val="333333"/>
+          <w:sz w:val="22"/>
+          <w:szCs w:val="22"/>
+          <w:vertAlign w:val="subscript"/>
+        </w:rPr>
+        <w:t xml:space="preserve">n</w:t>
+      </w:r>
+      <w:r>
+        <w:rPr>
+          <w:rFonts w:ascii="Cambria" w:cs="Cambria" w:eastAsia="Cambria" w:hAnsi="Cambria"/>
+          <w:color w:val="333333"/>
+          <w:sz w:val="22"/>
+          <w:szCs w:val="22"/>
+        </w:rPr>
+        <w:t xml:space="preserve">). Substituting ω</w:t>
+      </w:r>
+      <w:r>
+        <w:rPr>
+          <w:rFonts w:ascii="Cambria" w:cs="Cambria" w:eastAsia="Cambria" w:hAnsi="Cambria"/>
+          <w:color w:val="333333"/>
+          <w:sz w:val="22"/>
+          <w:szCs w:val="22"/>
+          <w:vertAlign w:val="subscript"/>
+        </w:rPr>
+        <w:t xml:space="preserve">n</w:t>
+      </w:r>
+      <w:r>
+        <w:rPr>
+          <w:rFonts w:ascii="Cambria" w:cs="Cambria" w:eastAsia="Cambria" w:hAnsi="Cambria"/>
+          <w:color w:val="333333"/>
+          <w:sz w:val="22"/>
+          <w:szCs w:val="22"/>
+        </w:rPr>
+        <w:t xml:space="preserve"> = √(K/m) and simplifying:</w:t>
+      </w:r>
+    </w:p>
+    <w:p>
+      <w:pPr>
+        <w:tabs>
+          <w:tab w:val="right" w:pos="9026"/>
+        </w:tabs>
+        <w:spacing w:after="150" w:before="120"/>
+        <w:ind w:left="360"/>
+      </w:pPr>
+      <w:r>
+        <w:rPr>
+          <w:rFonts w:ascii="Cambria" w:cs="Cambria" w:eastAsia="Cambria" w:hAnsi="Cambria"/>
+          <w:color w:val="333333"/>
+          <w:sz w:val="24"/>
+          <w:szCs w:val="24"/>
+        </w:rPr>
+        <w:t xml:space="preserve">ω</w:t>
+      </w:r>
+      <w:r>
+        <w:rPr>
+          <w:rFonts w:ascii="Cambria" w:cs="Cambria" w:eastAsia="Cambria" w:hAnsi="Cambria"/>
+          <w:color w:val="333333"/>
+          <w:sz w:val="24"/>
+          <w:szCs w:val="24"/>
+          <w:vertAlign w:val="subscript"/>
+        </w:rPr>
+        <w:t xml:space="preserve">n</w:t>
+      </w:r>
+      <w:r>
+        <w:rPr>
+          <w:rFonts w:ascii="Cambria" w:cs="Cambria" w:eastAsia="Cambria" w:hAnsi="Cambria"/>
+          <w:color w:val="333333"/>
+          <w:sz w:val="24"/>
+          <w:szCs w:val="24"/>
+        </w:rPr>
+        <w:t xml:space="preserve">  =  √(K/m),        ζ  =  D / (2√(K m))</w:t>
+      </w:r>
+      <w:r>
+        <w:rPr>
+          <w:rFonts w:ascii="Cambria" w:cs="Cambria" w:eastAsia="Cambria" w:hAnsi="Cambria"/>
+          <w:color w:val="666666"/>
+          <w:sz w:val="20"/>
+          <w:szCs w:val="20"/>
+        </w:rPr>
+        <w:t xml:space="preserve">	</w:t>
+        <w:t xml:space="preserve">(H.23)</w:t>
+      </w:r>
+    </w:p>
+    <w:p>
+      <w:pPr>
+        <w:keepNext/>
+        <w:spacing w:after="130" w:before="280"/>
+      </w:pPr>
+      <w:r>
+        <w:rPr>
+          <w:rFonts w:ascii="Georgia" w:cs="Georgia" w:eastAsia="Georgia" w:hAnsi="Georgia"/>
+          <w:b/>
+          <w:bCs/>
+          <w:color w:val="2E86AB"/>
+          <w:sz w:val="26"/>
+          <w:szCs w:val="26"/>
+        </w:rPr>
+        <w:t xml:space="preserve">Step 6. The same gains on two masses</w:t>
+      </w:r>
+    </w:p>
+    <w:p>
+      <w:pPr>
+        <w:keepNext w:val="false"/>
+        <w:spacing w:after="140" w:before="0" w:line="276"/>
+        <w:jc w:val="left"/>
+      </w:pPr>
+      <w:r>
+        <w:rPr>
+          <w:rFonts w:ascii="Cambria" w:cs="Cambria" w:eastAsia="Cambria" w:hAnsi="Cambria"/>
+          <w:color w:val="333333"/>
+          <w:sz w:val="22"/>
+          <w:szCs w:val="22"/>
+        </w:rPr>
+        <w:t xml:space="preserve">Take K = 10 N/m and D = 2 N s/m. On the light axis, m = 0.30 kg: ω</w:t>
+      </w:r>
+      <w:r>
+        <w:rPr>
+          <w:rFonts w:ascii="Cambria" w:cs="Cambria" w:eastAsia="Cambria" w:hAnsi="Cambria"/>
+          <w:color w:val="333333"/>
+          <w:sz w:val="22"/>
+          <w:szCs w:val="22"/>
+          <w:vertAlign w:val="subscript"/>
+        </w:rPr>
+        <w:t xml:space="preserve">n</w:t>
+      </w:r>
+      <w:r>
+        <w:rPr>
+          <w:rFonts w:ascii="Cambria" w:cs="Cambria" w:eastAsia="Cambria" w:hAnsi="Cambria"/>
+          <w:color w:val="333333"/>
+          <w:sz w:val="22"/>
+          <w:szCs w:val="22"/>
+        </w:rPr>
+        <w:t xml:space="preserve"> = √(10/0.30) = 5.77 rad/s and ζ = 2/(2√(10 × 0.30)) = 0.58. The poles are −3.33 ± 4.71i.</w:t>
+      </w:r>
+    </w:p>
+    <w:p>
+      <w:pPr>
+        <w:keepNext w:val="false"/>
+        <w:spacing w:after="140" w:before="0" w:line="276"/>
+        <w:jc w:val="left"/>
+      </w:pPr>
+      <w:r>
+        <w:rPr>
+          <w:rFonts w:ascii="Cambria" w:cs="Cambria" w:eastAsia="Cambria" w:hAnsi="Cambria"/>
+          <w:color w:val="333333"/>
+          <w:sz w:val="22"/>
+          <w:szCs w:val="22"/>
+        </w:rPr>
+        <w:t xml:space="preserve">On the heavy axis, m = 2.09 kg: ω</w:t>
+      </w:r>
+      <w:r>
+        <w:rPr>
+          <w:rFonts w:ascii="Cambria" w:cs="Cambria" w:eastAsia="Cambria" w:hAnsi="Cambria"/>
+          <w:color w:val="333333"/>
+          <w:sz w:val="22"/>
+          <w:szCs w:val="22"/>
+          <w:vertAlign w:val="subscript"/>
+        </w:rPr>
+        <w:t xml:space="preserve">n</w:t>
+      </w:r>
+      <w:r>
+        <w:rPr>
+          <w:rFonts w:ascii="Cambria" w:cs="Cambria" w:eastAsia="Cambria" w:hAnsi="Cambria"/>
+          <w:color w:val="333333"/>
+          <w:sz w:val="22"/>
+          <w:szCs w:val="22"/>
+        </w:rPr>
+        <w:t xml:space="preserve"> = √(10/2.09) = 2.19 rad/s and ζ = 2/(2√(10 × 2.09)) = 0.22. The poles are −0.48 ± 2.14i, much closer to the vertical axis, so the swings last longer (Board 4).</w:t>
+      </w:r>
+    </w:p>
+    <w:p>
+      <w:pPr>
+        <w:keepNext w:val="false"/>
+        <w:spacing w:after="140" w:before="0" w:line="276"/>
+        <w:jc w:val="left"/>
+      </w:pPr>
+      <w:r>
+        <w:rPr>
+          <w:rFonts w:ascii="Cambria" w:cs="Cambria" w:eastAsia="Cambria" w:hAnsi="Cambria"/>
+          <w:color w:val="333333"/>
+          <w:sz w:val="22"/>
+          <w:szCs w:val="22"/>
+        </w:rPr>
+        <w:t xml:space="preserve">From ζ alone, Board 6's formula predicts overshoots of 11% and 49%. The simulated responses overshoot by 26% and 55% (Figure 8B). The difference is the numerator's zero at s = −K/D = −5, as in Board 7.</w:t>
+      </w:r>
+    </w:p>
+    <w:p>
+      <w:pPr>
+        <w:keepNext w:val="false"/>
+        <w:spacing w:after="140" w:before="0" w:line="276"/>
+        <w:jc w:val="left"/>
+      </w:pPr>
+      <w:r>
+        <w:rPr>
+          <w:rFonts w:ascii="Cambria" w:cs="Cambria" w:eastAsia="Cambria" w:hAnsi="Cambria"/>
+          <w:color w:val="333333"/>
+          <w:sz w:val="22"/>
+          <w:szCs w:val="22"/>
+        </w:rPr>
+        <w:t xml:space="preserve">The two damping ratios differ by √(2.09/0.30) = 2.6. The same gains suit one axis and not the other.</w:t>
+      </w:r>
+    </w:p>
+    <w:p>
+      <w:pPr>
+        <w:keepNext/>
+        <w:spacing w:after="130" w:before="280"/>
+      </w:pPr>
+      <w:r>
+        <w:rPr>
+          <w:rFonts w:ascii="Georgia" w:cs="Georgia" w:eastAsia="Georgia" w:hAnsi="Georgia"/>
+          <w:b/>
+          <w:bCs/>
+          <w:color w:val="2E86AB"/>
+          <w:sz w:val="26"/>
+          <w:szCs w:val="26"/>
+        </w:rPr>
+        <w:t xml:space="preserve">Step 7. Command an acceleration instead</w:t>
+      </w:r>
+    </w:p>
+    <w:p>
+      <w:pPr>
+        <w:keepNext w:val="false"/>
+        <w:spacing w:after="140" w:before="0" w:line="276"/>
+        <w:jc w:val="left"/>
+      </w:pPr>
+      <w:r>
+        <w:rPr>
+          <w:rFonts w:ascii="Cambria" w:cs="Cambria" w:eastAsia="Cambria" w:hAnsi="Cambria"/>
+          <w:color w:val="333333"/>
+          <w:sz w:val="22"/>
+          <w:szCs w:val="22"/>
+        </w:rPr>
+        <w:t xml:space="preserve">Week 6's inverse dynamics removes the difference (Figure 7B). The controller now commands a hand acceleration a. The torque τ = M(q) J(q)</w:t>
+      </w:r>
+      <w:r>
+        <w:rPr>
+          <w:rFonts w:ascii="Cambria" w:cs="Cambria" w:eastAsia="Cambria" w:hAnsi="Cambria"/>
+          <w:color w:val="333333"/>
+          <w:sz w:val="22"/>
+          <w:szCs w:val="22"/>
+          <w:vertAlign w:val="superscript"/>
+        </w:rPr>
+        <w:t xml:space="preserve">−1</w:t>
+      </w:r>
+      <w:r>
+        <w:rPr>
+          <w:rFonts w:ascii="Cambria" w:cs="Cambria" w:eastAsia="Cambria" w:hAnsi="Cambria"/>
+          <w:color w:val="333333"/>
+          <w:sz w:val="22"/>
+          <w:szCs w:val="22"/>
+        </w:rPr>
+        <w:t xml:space="preserve"> a gives the joint acceleration J</w:t>
+      </w:r>
+      <w:r>
+        <w:rPr>
+          <w:rFonts w:ascii="Cambria" w:cs="Cambria" w:eastAsia="Cambria" w:hAnsi="Cambria"/>
+          <w:color w:val="333333"/>
+          <w:sz w:val="22"/>
+          <w:szCs w:val="22"/>
+          <w:vertAlign w:val="superscript"/>
+        </w:rPr>
+        <w:t xml:space="preserve">−1</w:t>
+      </w:r>
+      <w:r>
+        <w:rPr>
+          <w:rFonts w:ascii="Cambria" w:cs="Cambria" w:eastAsia="Cambria" w:hAnsi="Cambria"/>
+          <w:color w:val="333333"/>
+          <w:sz w:val="22"/>
+          <w:szCs w:val="22"/>
+        </w:rPr>
+        <w:t xml:space="preserve"> a, so near a resting posture the hand accelerates by exactly a, in every direction (notes §3.1).</w:t>
+      </w:r>
+    </w:p>
+    <w:p>
+      <w:pPr>
+        <w:keepNext/>
+        <w:spacing w:after="140" w:before="0" w:line="276"/>
+        <w:jc w:val="left"/>
+      </w:pPr>
+      <w:r>
+        <w:rPr>
+          <w:rFonts w:ascii="Cambria" w:cs="Cambria" w:eastAsia="Cambria" w:hAnsi="Cambria"/>
+          <w:color w:val="333333"/>
+          <w:sz w:val="22"/>
+          <w:szCs w:val="22"/>
+        </w:rPr>
+        <w:t xml:space="preserve">From the controller's side, the plant is now G(s) = X(s)/A(s) = 1/s², Equation H.19 with m = 1. Steps 2 to 5 go through unchanged, with C(s) = K</w:t>
+      </w:r>
+      <w:r>
+        <w:rPr>
+          <w:rFonts w:ascii="Cambria" w:cs="Cambria" w:eastAsia="Cambria" w:hAnsi="Cambria"/>
+          <w:color w:val="333333"/>
+          <w:sz w:val="22"/>
+          <w:szCs w:val="22"/>
+          <w:vertAlign w:val="subscript"/>
+        </w:rPr>
+        <w:t xml:space="preserve">p</w:t>
+      </w:r>
+      <w:r>
+        <w:rPr>
+          <w:rFonts w:ascii="Cambria" w:cs="Cambria" w:eastAsia="Cambria" w:hAnsi="Cambria"/>
+          <w:color w:val="333333"/>
+          <w:sz w:val="22"/>
+          <w:szCs w:val="22"/>
+        </w:rPr>
+        <w:t xml:space="preserve"> + K</w:t>
+      </w:r>
+      <w:r>
+        <w:rPr>
+          <w:rFonts w:ascii="Cambria" w:cs="Cambria" w:eastAsia="Cambria" w:hAnsi="Cambria"/>
+          <w:color w:val="333333"/>
+          <w:sz w:val="22"/>
+          <w:szCs w:val="22"/>
+          <w:vertAlign w:val="subscript"/>
+        </w:rPr>
+        <w:t xml:space="preserve">d</w:t>
+      </w:r>
+      <w:r>
+        <w:rPr>
+          <w:rFonts w:ascii="Cambria" w:cs="Cambria" w:eastAsia="Cambria" w:hAnsi="Cambria"/>
+          <w:color w:val="333333"/>
+          <w:sz w:val="22"/>
+          <w:szCs w:val="22"/>
+        </w:rPr>
+        <w:t xml:space="preserve"> s:</w:t>
+      </w:r>
+    </w:p>
+    <w:p>
+      <w:pPr>
+        <w:tabs>
+          <w:tab w:val="right" w:pos="9026"/>
+        </w:tabs>
+        <w:spacing w:after="150" w:before="120"/>
+        <w:ind w:left="360"/>
+      </w:pPr>
+      <w:r>
+        <w:rPr>
+          <w:rFonts w:ascii="Cambria" w:cs="Cambria" w:eastAsia="Cambria" w:hAnsi="Cambria"/>
+          <w:color w:val="333333"/>
+          <w:sz w:val="24"/>
+          <w:szCs w:val="24"/>
+        </w:rPr>
+        <w:t xml:space="preserve">T(s)  =  (K</w:t>
+      </w:r>
+      <w:r>
+        <w:rPr>
+          <w:rFonts w:ascii="Cambria" w:cs="Cambria" w:eastAsia="Cambria" w:hAnsi="Cambria"/>
+          <w:color w:val="333333"/>
+          <w:sz w:val="24"/>
+          <w:szCs w:val="24"/>
+          <w:vertAlign w:val="subscript"/>
+        </w:rPr>
+        <w:t xml:space="preserve">d</w:t>
+      </w:r>
+      <w:r>
+        <w:rPr>
+          <w:rFonts w:ascii="Cambria" w:cs="Cambria" w:eastAsia="Cambria" w:hAnsi="Cambria"/>
+          <w:color w:val="333333"/>
+          <w:sz w:val="24"/>
+          <w:szCs w:val="24"/>
+        </w:rPr>
+        <w:t xml:space="preserve"> s + K</w:t>
+      </w:r>
+      <w:r>
+        <w:rPr>
+          <w:rFonts w:ascii="Cambria" w:cs="Cambria" w:eastAsia="Cambria" w:hAnsi="Cambria"/>
+          <w:color w:val="333333"/>
+          <w:sz w:val="24"/>
+          <w:szCs w:val="24"/>
+          <w:vertAlign w:val="subscript"/>
+        </w:rPr>
+        <w:t xml:space="preserve">p</w:t>
+      </w:r>
+      <w:r>
+        <w:rPr>
+          <w:rFonts w:ascii="Cambria" w:cs="Cambria" w:eastAsia="Cambria" w:hAnsi="Cambria"/>
+          <w:color w:val="333333"/>
+          <w:sz w:val="24"/>
+          <w:szCs w:val="24"/>
+        </w:rPr>
+        <w:t xml:space="preserve">) / (s² + K</w:t>
+      </w:r>
+      <w:r>
+        <w:rPr>
+          <w:rFonts w:ascii="Cambria" w:cs="Cambria" w:eastAsia="Cambria" w:hAnsi="Cambria"/>
+          <w:color w:val="333333"/>
+          <w:sz w:val="24"/>
+          <w:szCs w:val="24"/>
+          <w:vertAlign w:val="subscript"/>
+        </w:rPr>
+        <w:t xml:space="preserve">d</w:t>
+      </w:r>
+      <w:r>
+        <w:rPr>
+          <w:rFonts w:ascii="Cambria" w:cs="Cambria" w:eastAsia="Cambria" w:hAnsi="Cambria"/>
+          <w:color w:val="333333"/>
+          <w:sz w:val="24"/>
+          <w:szCs w:val="24"/>
+        </w:rPr>
+        <w:t xml:space="preserve"> s + K</w:t>
+      </w:r>
+      <w:r>
+        <w:rPr>
+          <w:rFonts w:ascii="Cambria" w:cs="Cambria" w:eastAsia="Cambria" w:hAnsi="Cambria"/>
+          <w:color w:val="333333"/>
+          <w:sz w:val="24"/>
+          <w:szCs w:val="24"/>
+          <w:vertAlign w:val="subscript"/>
+        </w:rPr>
+        <w:t xml:space="preserve">p</w:t>
+      </w:r>
+      <w:r>
+        <w:rPr>
+          <w:rFonts w:ascii="Cambria" w:cs="Cambria" w:eastAsia="Cambria" w:hAnsi="Cambria"/>
+          <w:color w:val="333333"/>
+          <w:sz w:val="24"/>
+          <w:szCs w:val="24"/>
+        </w:rPr>
+        <w:t xml:space="preserve">),      ω</w:t>
+      </w:r>
+      <w:r>
+        <w:rPr>
+          <w:rFonts w:ascii="Cambria" w:cs="Cambria" w:eastAsia="Cambria" w:hAnsi="Cambria"/>
+          <w:color w:val="333333"/>
+          <w:sz w:val="24"/>
+          <w:szCs w:val="24"/>
+          <w:vertAlign w:val="subscript"/>
+        </w:rPr>
+        <w:t xml:space="preserve">n</w:t>
+      </w:r>
+      <w:r>
+        <w:rPr>
+          <w:rFonts w:ascii="Cambria" w:cs="Cambria" w:eastAsia="Cambria" w:hAnsi="Cambria"/>
+          <w:color w:val="333333"/>
+          <w:sz w:val="24"/>
+          <w:szCs w:val="24"/>
+        </w:rPr>
+        <w:t xml:space="preserve">  =  √K</w:t>
+      </w:r>
+      <w:r>
+        <w:rPr>
+          <w:rFonts w:ascii="Cambria" w:cs="Cambria" w:eastAsia="Cambria" w:hAnsi="Cambria"/>
+          <w:color w:val="333333"/>
+          <w:sz w:val="24"/>
+          <w:szCs w:val="24"/>
+          <w:vertAlign w:val="subscript"/>
+        </w:rPr>
+        <w:t xml:space="preserve">p</w:t>
+      </w:r>
+      <w:r>
+        <w:rPr>
+          <w:rFonts w:ascii="Cambria" w:cs="Cambria" w:eastAsia="Cambria" w:hAnsi="Cambria"/>
+          <w:color w:val="333333"/>
+          <w:sz w:val="24"/>
+          <w:szCs w:val="24"/>
+        </w:rPr>
+        <w:t xml:space="preserve">,      ζ  =  K</w:t>
+      </w:r>
+      <w:r>
+        <w:rPr>
+          <w:rFonts w:ascii="Cambria" w:cs="Cambria" w:eastAsia="Cambria" w:hAnsi="Cambria"/>
+          <w:color w:val="333333"/>
+          <w:sz w:val="24"/>
+          <w:szCs w:val="24"/>
+          <w:vertAlign w:val="subscript"/>
+        </w:rPr>
+        <w:t xml:space="preserve">d</w:t>
+      </w:r>
+      <w:r>
+        <w:rPr>
+          <w:rFonts w:ascii="Cambria" w:cs="Cambria" w:eastAsia="Cambria" w:hAnsi="Cambria"/>
+          <w:color w:val="333333"/>
+          <w:sz w:val="24"/>
+          <w:szCs w:val="24"/>
+        </w:rPr>
+        <w:t xml:space="preserve"> / (2√K</w:t>
+      </w:r>
+      <w:r>
+        <w:rPr>
+          <w:rFonts w:ascii="Cambria" w:cs="Cambria" w:eastAsia="Cambria" w:hAnsi="Cambria"/>
+          <w:color w:val="333333"/>
+          <w:sz w:val="24"/>
+          <w:szCs w:val="24"/>
+          <w:vertAlign w:val="subscript"/>
+        </w:rPr>
+        <w:t xml:space="preserve">p</w:t>
+      </w:r>
+      <w:r>
+        <w:rPr>
+          <w:rFonts w:ascii="Cambria" w:cs="Cambria" w:eastAsia="Cambria" w:hAnsi="Cambria"/>
+          <w:color w:val="333333"/>
+          <w:sz w:val="24"/>
+          <w:szCs w:val="24"/>
+        </w:rPr>
+        <w:t xml:space="preserve">)</w:t>
+      </w:r>
+      <w:r>
+        <w:rPr>
+          <w:rFonts w:ascii="Cambria" w:cs="Cambria" w:eastAsia="Cambria" w:hAnsi="Cambria"/>
+          <w:color w:val="666666"/>
+          <w:sz w:val="20"/>
+          <w:szCs w:val="20"/>
+        </w:rPr>
+        <w:t xml:space="preserve">	</w:t>
+        <w:t xml:space="preserve">(H.24)</w:t>
+      </w:r>
+    </w:p>
+    <w:p>
+      <w:pPr>
+        <w:keepNext w:val="false"/>
+        <w:spacing w:after="140" w:before="0" w:line="276"/>
+        <w:jc w:val="left"/>
+      </w:pPr>
+      <w:r>
+        <w:rPr>
+          <w:rFonts w:ascii="Cambria" w:cs="Cambria" w:eastAsia="Cambria" w:hAnsi="Cambria"/>
+          <w:color w:val="333333"/>
+          <w:sz w:val="22"/>
+          <w:szCs w:val="22"/>
+        </w:rPr>
+        <w:t xml:space="preserve">No mass appears in Equation H.24, so every direction behaves the same. The gains are per unit mass: K</w:t>
+      </w:r>
+      <w:r>
+        <w:rPr>
+          <w:rFonts w:ascii="Cambria" w:cs="Cambria" w:eastAsia="Cambria" w:hAnsi="Cambria"/>
+          <w:color w:val="333333"/>
+          <w:sz w:val="22"/>
+          <w:szCs w:val="22"/>
+          <w:vertAlign w:val="subscript"/>
+        </w:rPr>
+        <w:t xml:space="preserve">p</w:t>
+      </w:r>
+      <w:r>
+        <w:rPr>
+          <w:rFonts w:ascii="Cambria" w:cs="Cambria" w:eastAsia="Cambria" w:hAnsi="Cambria"/>
+          <w:color w:val="333333"/>
+          <w:sz w:val="22"/>
+          <w:szCs w:val="22"/>
+        </w:rPr>
+        <w:t xml:space="preserve"> in 1/s² and K</w:t>
+      </w:r>
+      <w:r>
+        <w:rPr>
+          <w:rFonts w:ascii="Cambria" w:cs="Cambria" w:eastAsia="Cambria" w:hAnsi="Cambria"/>
+          <w:color w:val="333333"/>
+          <w:sz w:val="22"/>
+          <w:szCs w:val="22"/>
+          <w:vertAlign w:val="subscript"/>
+        </w:rPr>
+        <w:t xml:space="preserve">d</w:t>
+      </w:r>
+      <w:r>
+        <w:rPr>
+          <w:rFonts w:ascii="Cambria" w:cs="Cambria" w:eastAsia="Cambria" w:hAnsi="Cambria"/>
+          <w:color w:val="333333"/>
+          <w:sz w:val="22"/>
+          <w:szCs w:val="22"/>
+        </w:rPr>
+        <w:t xml:space="preserve"> in 1/s. On an axis of mass m they act like a force command with K = m K</w:t>
+      </w:r>
+      <w:r>
+        <w:rPr>
+          <w:rFonts w:ascii="Cambria" w:cs="Cambria" w:eastAsia="Cambria" w:hAnsi="Cambria"/>
+          <w:color w:val="333333"/>
+          <w:sz w:val="22"/>
+          <w:szCs w:val="22"/>
+          <w:vertAlign w:val="subscript"/>
+        </w:rPr>
+        <w:t xml:space="preserve">p</w:t>
+      </w:r>
+      <w:r>
+        <w:rPr>
+          <w:rFonts w:ascii="Cambria" w:cs="Cambria" w:eastAsia="Cambria" w:hAnsi="Cambria"/>
+          <w:color w:val="333333"/>
+          <w:sz w:val="22"/>
+          <w:szCs w:val="22"/>
+        </w:rPr>
+        <w:t xml:space="preserve"> and D = m K</w:t>
+      </w:r>
+      <w:r>
+        <w:rPr>
+          <w:rFonts w:ascii="Cambria" w:cs="Cambria" w:eastAsia="Cambria" w:hAnsi="Cambria"/>
+          <w:color w:val="333333"/>
+          <w:sz w:val="22"/>
+          <w:szCs w:val="22"/>
+          <w:vertAlign w:val="subscript"/>
+        </w:rPr>
+        <w:t xml:space="preserve">d</w:t>
+      </w:r>
+      <w:r>
+        <w:rPr>
+          <w:rFonts w:ascii="Cambria" w:cs="Cambria" w:eastAsia="Cambria" w:hAnsi="Cambria"/>
+          <w:color w:val="333333"/>
+          <w:sz w:val="22"/>
+          <w:szCs w:val="22"/>
+        </w:rPr>
+        <w:t xml:space="preserve">, matched to that axis.</w:t>
+      </w:r>
+    </w:p>
+    <w:p>
+      <w:pPr>
+        <w:keepNext w:val="false"/>
+        <w:spacing w:after="140" w:before="0" w:line="276"/>
+        <w:jc w:val="left"/>
+      </w:pPr>
+      <w:r>
+        <w:rPr>
+          <w:rFonts w:ascii="Cambria" w:cs="Cambria" w:eastAsia="Cambria" w:hAnsi="Cambria"/>
+          <w:color w:val="333333"/>
+          <w:sz w:val="22"/>
+          <w:szCs w:val="22"/>
+        </w:rPr>
+        <w:t xml:space="preserve">With Board 11's gains, K</w:t>
+      </w:r>
+      <w:r>
+        <w:rPr>
+          <w:rFonts w:ascii="Cambria" w:cs="Cambria" w:eastAsia="Cambria" w:hAnsi="Cambria"/>
+          <w:color w:val="333333"/>
+          <w:sz w:val="22"/>
+          <w:szCs w:val="22"/>
+          <w:vertAlign w:val="subscript"/>
+        </w:rPr>
+        <w:t xml:space="preserve">p</w:t>
+      </w:r>
+      <w:r>
+        <w:rPr>
+          <w:rFonts w:ascii="Cambria" w:cs="Cambria" w:eastAsia="Cambria" w:hAnsi="Cambria"/>
+          <w:color w:val="333333"/>
+          <w:sz w:val="22"/>
+          <w:szCs w:val="22"/>
+        </w:rPr>
+        <w:t xml:space="preserve"> = 8.3 s</w:t>
+      </w:r>
+      <w:r>
+        <w:rPr>
+          <w:rFonts w:ascii="Cambria" w:cs="Cambria" w:eastAsia="Cambria" w:hAnsi="Cambria"/>
+          <w:color w:val="333333"/>
+          <w:sz w:val="22"/>
+          <w:szCs w:val="22"/>
+          <w:vertAlign w:val="superscript"/>
+        </w:rPr>
+        <w:t xml:space="preserve">−2</w:t>
+      </w:r>
+      <w:r>
+        <w:rPr>
+          <w:rFonts w:ascii="Cambria" w:cs="Cambria" w:eastAsia="Cambria" w:hAnsi="Cambria"/>
+          <w:color w:val="333333"/>
+          <w:sz w:val="22"/>
+          <w:szCs w:val="22"/>
+        </w:rPr>
+        <w:t xml:space="preserve"> and K</w:t>
+      </w:r>
+      <w:r>
+        <w:rPr>
+          <w:rFonts w:ascii="Cambria" w:cs="Cambria" w:eastAsia="Cambria" w:hAnsi="Cambria"/>
+          <w:color w:val="333333"/>
+          <w:sz w:val="22"/>
+          <w:szCs w:val="22"/>
+          <w:vertAlign w:val="subscript"/>
+        </w:rPr>
+        <w:t xml:space="preserve">d</w:t>
+      </w:r>
+      <w:r>
+        <w:rPr>
+          <w:rFonts w:ascii="Cambria" w:cs="Cambria" w:eastAsia="Cambria" w:hAnsi="Cambria"/>
+          <w:color w:val="333333"/>
+          <w:sz w:val="22"/>
+          <w:szCs w:val="22"/>
+        </w:rPr>
+        <w:t xml:space="preserve"> = 5.8 s</w:t>
+      </w:r>
+      <w:r>
+        <w:rPr>
+          <w:rFonts w:ascii="Cambria" w:cs="Cambria" w:eastAsia="Cambria" w:hAnsi="Cambria"/>
+          <w:color w:val="333333"/>
+          <w:sz w:val="22"/>
+          <w:szCs w:val="22"/>
+          <w:vertAlign w:val="superscript"/>
+        </w:rPr>
+        <w:t xml:space="preserve">−1</w:t>
+      </w:r>
+      <w:r>
+        <w:rPr>
+          <w:rFonts w:ascii="Cambria" w:cs="Cambria" w:eastAsia="Cambria" w:hAnsi="Cambria"/>
+          <w:color w:val="333333"/>
+          <w:sz w:val="22"/>
+          <w:szCs w:val="22"/>
+        </w:rPr>
+        <w:t xml:space="preserve">, both axes have ω</w:t>
+      </w:r>
+      <w:r>
+        <w:rPr>
+          <w:rFonts w:ascii="Cambria" w:cs="Cambria" w:eastAsia="Cambria" w:hAnsi="Cambria"/>
+          <w:color w:val="333333"/>
+          <w:sz w:val="22"/>
+          <w:szCs w:val="22"/>
+          <w:vertAlign w:val="subscript"/>
+        </w:rPr>
+        <w:t xml:space="preserve">n</w:t>
+      </w:r>
+      <w:r>
+        <w:rPr>
+          <w:rFonts w:ascii="Cambria" w:cs="Cambria" w:eastAsia="Cambria" w:hAnsi="Cambria"/>
+          <w:color w:val="333333"/>
+          <w:sz w:val="22"/>
+          <w:szCs w:val="22"/>
+        </w:rPr>
+        <w:t xml:space="preserve"> = 2.89 rad/s and ζ = 1.01. As force gains, K is 2.5 N/m on the light axis and 17.4 N/m on the heavy one (Figure 8C).</w:t>
+      </w:r>
+    </w:p>
+    <w:p>
+      <w:pPr>
+        <w:keepNext w:val="false"/>
+        <w:spacing w:after="140" w:before="0" w:line="276"/>
+        <w:jc w:val="left"/>
+      </w:pPr>
+      <w:r>
+        <w:rPr>
+          <w:rFonts w:ascii="Cambria" w:cs="Cambria" w:eastAsia="Cambria" w:hAnsi="Cambria"/>
+          <w:color w:val="333333"/>
+          <w:sz w:val="22"/>
+          <w:szCs w:val="22"/>
+        </w:rPr>
+        <w:t xml:space="preserve">With ζ just above 1, the poles are real, at −2.58 and −3.23. The step still overshoots by 13%, because the zero at −K</w:t>
+      </w:r>
+      <w:r>
+        <w:rPr>
+          <w:rFonts w:ascii="Cambria" w:cs="Cambria" w:eastAsia="Cambria" w:hAnsi="Cambria"/>
+          <w:color w:val="333333"/>
+          <w:sz w:val="22"/>
+          <w:szCs w:val="22"/>
+          <w:vertAlign w:val="subscript"/>
+        </w:rPr>
+        <w:t xml:space="preserve">p</w:t>
+      </w:r>
+      <w:r>
+        <w:rPr>
+          <w:rFonts w:ascii="Cambria" w:cs="Cambria" w:eastAsia="Cambria" w:hAnsi="Cambria"/>
+          <w:color w:val="333333"/>
+          <w:sz w:val="22"/>
+          <w:szCs w:val="22"/>
+        </w:rPr>
+        <w:t xml:space="preserve">/K</w:t>
+      </w:r>
+      <w:r>
+        <w:rPr>
+          <w:rFonts w:ascii="Cambria" w:cs="Cambria" w:eastAsia="Cambria" w:hAnsi="Cambria"/>
+          <w:color w:val="333333"/>
+          <w:sz w:val="22"/>
+          <w:szCs w:val="22"/>
+          <w:vertAlign w:val="subscript"/>
+        </w:rPr>
+        <w:t xml:space="preserve">d</w:t>
+      </w:r>
+      <w:r>
+        <w:rPr>
+          <w:rFonts w:ascii="Cambria" w:cs="Cambria" w:eastAsia="Cambria" w:hAnsi="Cambria"/>
+          <w:color w:val="333333"/>
+          <w:sz w:val="22"/>
+          <w:szCs w:val="22"/>
+        </w:rPr>
+        <w:t xml:space="preserve"> = −1.43 is slower than both poles. Board 11 starts the hand from an offset with a still target, and that response depends on the poles alone.</w:t>
+      </w:r>
+    </w:p>
+    <w:p>
+      <w:pPr>
+        <w:keepNext/>
+        <w:keepLines/>
+        <w:spacing w:after="80" w:before="120"/>
+        <w:jc w:val="center"/>
+      </w:pPr>
+      <w:r>
+        <w:drawing>
+          <wp:inline distT="0" distB="0" distL="0" distR="0">
+            <wp:extent cx="5715000" cy="1914525"/>
+            <wp:effectExtent t="0" r="0" b="0" l="0"/>
+            <wp:docPr id="1" name="" descr="" title=""/>
+            <wp:cNvGraphicFramePr>
+              <a:graphicFrameLocks xmlns:a="http://schemas.openxmlformats.org/drawingml/2006/main" noChangeAspect="1"/>
+            </wp:cNvGraphicFramePr>
+            <a:graphic xmlns:a="http://schemas.openxmlformats.org/drawingml/2006/main">
+              <a:graphicData uri="http://schemas.openxmlformats.org/drawingml/2006/picture">
+                <pic:pic xmlns:pic="http://schemas.openxmlformats.org/drawingml/2006/picture">
+                  <pic:nvPicPr>
+                    <pic:cNvPr id="0" name="" descr=""/>
+                    <pic:cNvPicPr>
+                      <a:picLocks noChangeAspect="1" noChangeArrowheads="1"/>
+                    </pic:cNvPicPr>
+                  </pic:nvPicPr>
+                  <pic:blipFill>
+                    <a:blip r:embed="rId16" cstate="none"/>
+                    <a:srcRect/>
+                    <a:stretch>
+                      <a:fillRect/>
+                    </a:stretch>
+                  </pic:blipFill>
+                  <pic:spPr bwMode="auto">
+                    <a:xfrm>
+                      <a:off x="0" y="0"/>
+                      <a:ext cx="5715000" cy="1914525"/>
+                    </a:xfrm>
+                    <a:prstGeom prst="rect">
+                      <a:avLst/>
+                    </a:prstGeom>
+                  </pic:spPr>
+                </pic:pic>
+              </a:graphicData>
+            </a:graphic>
+          </wp:inline>
+        </w:drawing>
+      </w:r>
+    </w:p>
+    <w:p>
+      <w:pPr>
+        <w:keepNext w:val="false"/>
+        <w:keepLines/>
+        <w:spacing w:after="200" w:before="0" w:line="264"/>
+      </w:pPr>
+      <w:r>
+        <w:rPr>
+          <w:rFonts w:ascii="Cambria" w:cs="Cambria" w:eastAsia="Cambria" w:hAnsi="Cambria"/>
+          <w:b/>
+          <w:bCs/>
+          <w:color w:val="333333"/>
+          <w:sz w:val="19"/>
+          <w:szCs w:val="19"/>
+        </w:rPr>
+        <w:t xml:space="preserve">Figure 8. </w:t>
+      </w:r>
+      <w:r>
+        <w:rPr>
+          <w:rFonts w:ascii="Cambria" w:cs="Cambria" w:eastAsia="Cambria" w:hAnsi="Cambria"/>
+          <w:color w:val="333333"/>
+          <w:sz w:val="19"/>
+          <w:szCs w:val="19"/>
+        </w:rPr>
+        <w:t xml:space="preserve">The hand without a delay, along its two principal axes. A: the hand's mass when pushed in each direction at the start posture, drawn as the distance from the center. It is 0.30 kg along the light axis and 2.09 kg along the heavy axis, at right angles (Week 6 §2.1). B: the force command of Equation H.21, K = 10 N/m and D = 2 N s/m, step to a target; the same gains act on both masses. C: the acceleration command of Equation H.24, K</w:t>
       </w:r>
       <w:r>
         <w:rPr>
@@ -14290,7 +14420,26 @@
           <w:sz w:val="19"/>
           <w:szCs w:val="19"/>
         </w:rPr>
-        <w:t xml:space="preserve">Δ² and δ = K</w:t>
+        <w:t xml:space="preserve"> = 8.3 s</w:t>
+      </w:r>
+      <w:r>
+        <w:rPr>
+          <w:rFonts w:ascii="Cambria" w:cs="Cambria" w:eastAsia="Cambria" w:hAnsi="Cambria"/>
+          <w:color w:val="333333"/>
+          <w:sz w:val="19"/>
+          <w:szCs w:val="19"/>
+          <w:vertAlign w:val="superscript"/>
+        </w:rPr>
+        <w:t xml:space="preserve">−2</w:t>
+      </w:r>
+      <w:r>
+        <w:rPr>
+          <w:rFonts w:ascii="Cambria" w:cs="Cambria" w:eastAsia="Cambria" w:hAnsi="Cambria"/>
+          <w:color w:val="333333"/>
+          <w:sz w:val="19"/>
+          <w:szCs w:val="19"/>
+        </w:rPr>
+        <w:t xml:space="preserve"> and K</w:t>
       </w:r>
       <w:r>
         <w:rPr>
@@ -14309,7 +14458,189 @@
           <w:sz w:val="19"/>
           <w:szCs w:val="19"/>
         </w:rPr>
-        <w:t xml:space="preserve">Δ, with Δ = 155 ms in both.</w:t>
+        <w:t xml:space="preserve"> = 5.8 s</w:t>
+      </w:r>
+      <w:r>
+        <w:rPr>
+          <w:rFonts w:ascii="Cambria" w:cs="Cambria" w:eastAsia="Cambria" w:hAnsi="Cambria"/>
+          <w:color w:val="333333"/>
+          <w:sz w:val="19"/>
+          <w:szCs w:val="19"/>
+          <w:vertAlign w:val="superscript"/>
+        </w:rPr>
+        <w:t xml:space="preserve">−1</w:t>
+      </w:r>
+      <w:r>
+        <w:rPr>
+          <w:rFonts w:ascii="Cambria" w:cs="Cambria" w:eastAsia="Cambria" w:hAnsi="Cambria"/>
+          <w:color w:val="333333"/>
+          <w:sz w:val="19"/>
+          <w:szCs w:val="19"/>
+        </w:rPr>
+        <w:t xml:space="preserve"> (Board 11's gains): the two axes give the same response.</w:t>
+      </w:r>
+    </w:p>
+    <w:p>
+      <w:pPr>
+        <w:keepNext/>
+        <w:spacing w:after="130" w:before="280"/>
+      </w:pPr>
+      <w:r>
+        <w:rPr>
+          <w:rFonts w:ascii="Georgia" w:cs="Georgia" w:eastAsia="Georgia" w:hAnsi="Georgia"/>
+          <w:b/>
+          <w:bCs/>
+          <w:color w:val="2E86AB"/>
+          <w:sz w:val="26"/>
+          <w:szCs w:val="26"/>
+        </w:rPr>
+        <w:t xml:space="preserve">Step 8. Where this sits in the notes</w:t>
+      </w:r>
+    </w:p>
+    <w:p>
+      <w:pPr>
+        <w:keepNext w:val="false"/>
+        <w:spacing w:after="140" w:before="0" w:line="276"/>
+        <w:jc w:val="left"/>
+      </w:pPr>
+      <w:r>
+        <w:rPr>
+          <w:rFonts w:ascii="Cambria" w:cs="Cambria" w:eastAsia="Cambria" w:hAnsi="Cambria"/>
+          <w:color w:val="333333"/>
+          <w:sz w:val="22"/>
+          <w:szCs w:val="22"/>
+        </w:rPr>
+        <w:t xml:space="preserve">This PD command is the gains box of the notes' Figure 3. K</w:t>
+      </w:r>
+      <w:r>
+        <w:rPr>
+          <w:rFonts w:ascii="Cambria" w:cs="Cambria" w:eastAsia="Cambria" w:hAnsi="Cambria"/>
+          <w:color w:val="333333"/>
+          <w:sz w:val="22"/>
+          <w:szCs w:val="22"/>
+          <w:vertAlign w:val="subscript"/>
+        </w:rPr>
+        <w:t xml:space="preserve">p</w:t>
+      </w:r>
+      <w:r>
+        <w:rPr>
+          <w:rFonts w:ascii="Cambria" w:cs="Cambria" w:eastAsia="Cambria" w:hAnsi="Cambria"/>
+          <w:color w:val="333333"/>
+          <w:sz w:val="22"/>
+          <w:szCs w:val="22"/>
+        </w:rPr>
+        <w:t xml:space="preserve"> multiplies the position error e</w:t>
+      </w:r>
+      <w:r>
+        <w:rPr>
+          <w:rFonts w:ascii="Cambria" w:cs="Cambria" w:eastAsia="Cambria" w:hAnsi="Cambria"/>
+          <w:color w:val="333333"/>
+          <w:sz w:val="22"/>
+          <w:szCs w:val="22"/>
+          <w:vertAlign w:val="subscript"/>
+        </w:rPr>
+        <w:t xml:space="preserve">k</w:t>
+      </w:r>
+      <w:r>
+        <w:rPr>
+          <w:rFonts w:ascii="Cambria" w:cs="Cambria" w:eastAsia="Cambria" w:hAnsi="Cambria"/>
+          <w:color w:val="333333"/>
+          <w:sz w:val="22"/>
+          <w:szCs w:val="22"/>
+        </w:rPr>
+        <w:t xml:space="preserve">, between the plan and the latest sample, and K</w:t>
+      </w:r>
+      <w:r>
+        <w:rPr>
+          <w:rFonts w:ascii="Cambria" w:cs="Cambria" w:eastAsia="Cambria" w:hAnsi="Cambria"/>
+          <w:color w:val="333333"/>
+          <w:sz w:val="22"/>
+          <w:szCs w:val="22"/>
+          <w:vertAlign w:val="subscript"/>
+        </w:rPr>
+        <w:t xml:space="preserve">d</w:t>
+      </w:r>
+      <w:r>
+        <w:rPr>
+          <w:rFonts w:ascii="Cambria" w:cs="Cambria" w:eastAsia="Cambria" w:hAnsi="Cambria"/>
+          <w:color w:val="333333"/>
+          <w:sz w:val="22"/>
+          <w:szCs w:val="22"/>
+        </w:rPr>
+        <w:t xml:space="preserve"> multiplies its rate ė</w:t>
+      </w:r>
+      <w:r>
+        <w:rPr>
+          <w:rFonts w:ascii="Cambria" w:cs="Cambria" w:eastAsia="Cambria" w:hAnsi="Cambria"/>
+          <w:color w:val="333333"/>
+          <w:sz w:val="22"/>
+          <w:szCs w:val="22"/>
+          <w:vertAlign w:val="subscript"/>
+        </w:rPr>
+        <w:t xml:space="preserve">k</w:t>
+      </w:r>
+      <w:r>
+        <w:rPr>
+          <w:rFonts w:ascii="Cambria" w:cs="Cambria" w:eastAsia="Cambria" w:hAnsi="Cambria"/>
+          <w:color w:val="333333"/>
+          <w:sz w:val="22"/>
+          <w:szCs w:val="22"/>
+        </w:rPr>
+        <w:t xml:space="preserve">. The PD term only corrects the reach; Week 6's feedforward torque still drives it, along the top row of that figure.</w:t>
+      </w:r>
+    </w:p>
+    <w:p>
+      <w:pPr>
+        <w:keepNext w:val="false"/>
+        <w:spacing w:after="140" w:before="0" w:line="276"/>
+        <w:jc w:val="left"/>
+      </w:pPr>
+      <w:r>
+        <w:rPr>
+          <w:rFonts w:ascii="Cambria" w:cs="Cambria" w:eastAsia="Cambria" w:hAnsi="Cambria"/>
+          <w:color w:val="333333"/>
+          <w:sz w:val="22"/>
+          <w:szCs w:val="22"/>
+        </w:rPr>
+        <w:t xml:space="preserve">One more difference from the cart: vision reports only positions, so ė</w:t>
+      </w:r>
+      <w:r>
+        <w:rPr>
+          <w:rFonts w:ascii="Cambria" w:cs="Cambria" w:eastAsia="Cambria" w:hAnsi="Cambria"/>
+          <w:color w:val="333333"/>
+          <w:sz w:val="22"/>
+          <w:szCs w:val="22"/>
+          <w:vertAlign w:val="subscript"/>
+        </w:rPr>
+        <w:t xml:space="preserve">k</w:t>
+      </w:r>
+      <w:r>
+        <w:rPr>
+          <w:rFonts w:ascii="Cambria" w:cs="Cambria" w:eastAsia="Cambria" w:hAnsi="Cambria"/>
+          <w:color w:val="333333"/>
+          <w:sz w:val="22"/>
+          <w:szCs w:val="22"/>
+        </w:rPr>
+        <w:t xml:space="preserve"> is not a true derivative. It is the difference of two samples divided by T</w:t>
+      </w:r>
+      <w:r>
+        <w:rPr>
+          <w:rFonts w:ascii="Cambria" w:cs="Cambria" w:eastAsia="Cambria" w:hAnsi="Cambria"/>
+          <w:color w:val="333333"/>
+          <w:sz w:val="22"/>
+          <w:szCs w:val="22"/>
+          <w:vertAlign w:val="subscript"/>
+        </w:rPr>
+        <w:t xml:space="preserve">S</w:t>
+      </w:r>
+      <w:r>
+        <w:rPr>
+          <w:rFonts w:ascii="Cambria" w:cs="Cambria" w:eastAsia="Cambria" w:hAnsi="Cambria"/>
+          <w:color w:val="333333"/>
+          <w:sz w:val="22"/>
+          <w:szCs w:val="22"/>
+        </w:rPr>
+        <w:t xml:space="preserve"> (notes Equation 8.8).</w:t>
       </w:r>
     </w:p>
     <w:tbl>
@@ -14400,83 +14731,7 @@
                 <w:sz w:val="21"/>
                 <w:szCs w:val="21"/>
               </w:rPr>
-              <w:t xml:space="preserve">the controller sees e(t − Δ):    e(t − Δ) → e</w:t>
-            </w:r>
-            <w:r>
-              <w:rPr>
-                <w:rFonts w:ascii="Cambria" w:cs="Cambria" w:eastAsia="Cambria" w:hAnsi="Cambria"/>
-                <w:color w:val="333333"/>
-                <w:sz w:val="21"/>
-                <w:szCs w:val="21"/>
-                <w:vertAlign w:val="superscript"/>
-              </w:rPr>
-              <w:t xml:space="preserve">−sΔ</w:t>
-            </w:r>
-            <w:r>
-              <w:rPr>
-                <w:rFonts w:ascii="Cambria" w:cs="Cambria" w:eastAsia="Cambria" w:hAnsi="Cambria"/>
-                <w:color w:val="333333"/>
-                <w:sz w:val="21"/>
-                <w:szCs w:val="21"/>
-              </w:rPr>
-              <w:t xml:space="preserve"> E(s)    ⇒    s² + (K</w:t>
-            </w:r>
-            <w:r>
-              <w:rPr>
-                <w:rFonts w:ascii="Cambria" w:cs="Cambria" w:eastAsia="Cambria" w:hAnsi="Cambria"/>
-                <w:color w:val="333333"/>
-                <w:sz w:val="21"/>
-                <w:szCs w:val="21"/>
-                <w:vertAlign w:val="subscript"/>
-              </w:rPr>
-              <w:t xml:space="preserve">p</w:t>
-            </w:r>
-            <w:r>
-              <w:rPr>
-                <w:rFonts w:ascii="Cambria" w:cs="Cambria" w:eastAsia="Cambria" w:hAnsi="Cambria"/>
-                <w:color w:val="333333"/>
-                <w:sz w:val="21"/>
-                <w:szCs w:val="21"/>
-              </w:rPr>
-              <w:t xml:space="preserve"> + K</w:t>
-            </w:r>
-            <w:r>
-              <w:rPr>
-                <w:rFonts w:ascii="Cambria" w:cs="Cambria" w:eastAsia="Cambria" w:hAnsi="Cambria"/>
-                <w:color w:val="333333"/>
-                <w:sz w:val="21"/>
-                <w:szCs w:val="21"/>
-                <w:vertAlign w:val="subscript"/>
-              </w:rPr>
-              <w:t xml:space="preserve">d</w:t>
-            </w:r>
-            <w:r>
-              <w:rPr>
-                <w:rFonts w:ascii="Cambria" w:cs="Cambria" w:eastAsia="Cambria" w:hAnsi="Cambria"/>
-                <w:color w:val="333333"/>
-                <w:sz w:val="21"/>
-                <w:szCs w:val="21"/>
-              </w:rPr>
-              <w:t xml:space="preserve"> s) e</w:t>
-            </w:r>
-            <w:r>
-              <w:rPr>
-                <w:rFonts w:ascii="Cambria" w:cs="Cambria" w:eastAsia="Cambria" w:hAnsi="Cambria"/>
-                <w:color w:val="333333"/>
-                <w:sz w:val="21"/>
-                <w:szCs w:val="21"/>
-                <w:vertAlign w:val="superscript"/>
-              </w:rPr>
-              <w:t xml:space="preserve">−sΔ</w:t>
-            </w:r>
-            <w:r>
-              <w:rPr>
-                <w:rFonts w:ascii="Cambria" w:cs="Cambria" w:eastAsia="Cambria" w:hAnsi="Cambria"/>
-                <w:color w:val="333333"/>
-                <w:sz w:val="21"/>
-                <w:szCs w:val="21"/>
-              </w:rPr>
-              <w:t xml:space="preserve"> = 0</w:t>
+              <w:t xml:space="preserve">1.  m ẍ = F   ⇒   m s² X = F   ⇒   G(s) = 1/(m s²)</w:t>
             </w:r>
           </w:p>
         </w:tc>
@@ -14514,7 +14769,7 @@
                 <w:sz w:val="21"/>
                 <w:szCs w:val="21"/>
               </w:rPr>
-              <w:t xml:space="preserve">not a polynomial: infinitely many roots; the rightmost one decides (notes Eq. 8.5, 8.7)</w:t>
+              <w:t xml:space="preserve">2.  E = R − X,    F = C E,    X = G F;    C(s) = K + D s</w:t>
             </w:r>
           </w:p>
         </w:tc>
@@ -14552,7 +14807,7 @@
                 <w:sz w:val="21"/>
                 <w:szCs w:val="21"/>
               </w:rPr>
-              <w:t xml:space="preserve">κ = 0.2, δ = 0.9, Δ = 155 ms:   no delay ζ = 1.01;   with delay  s = −1.86 ± 7.29i</w:t>
+              <w:t xml:space="preserve">3.  C G = (D s + K)/(m s²);    1 + C G = (m s² + D s + K)/(m s²)    ⇒    T = (D s + K)/(m s² + D s + K)</w:t>
             </w:r>
           </w:p>
         </w:tc>
@@ -14574,6 +14829,177 @@
             <w:tcMar>
               <w:top w:type="dxa" w:w="0"/>
               <w:left w:type="dxa" w:w="200"/>
+              <w:bottom w:type="dxa" w:w="40"/>
+              <w:right w:type="dxa" w:w="200"/>
+            </w:tcMar>
+          </w:tcPr>
+          <w:p>
+            <w:pPr>
+              <w:keepNext/>
+              <w:spacing w:after="100" w:line="264"/>
+            </w:pPr>
+            <w:r>
+              <w:rPr>
+                <w:rFonts w:ascii="Cambria" w:cs="Cambria" w:eastAsia="Cambria" w:hAnsi="Cambria"/>
+                <w:color w:val="333333"/>
+                <w:sz w:val="21"/>
+                <w:szCs w:val="21"/>
+              </w:rPr>
+              <w:t xml:space="preserve">4.  G(0) = ∞   ⇒   e(∞) = 1/(1 + C(0) G(0)) = 0;    T(0) = K/K = 1</w:t>
+            </w:r>
+          </w:p>
+        </w:tc>
+      </w:tr>
+      <w:tr>
+        <w:trPr>
+          <w:cantSplit/>
+        </w:trPr>
+        <w:tc>
+          <w:tcPr>
+            <w:tcW w:type="dxa" w:w="9360"/>
+            <w:tcBorders>
+              <w:top w:val="none" w:color="FFFFFF" w:sz="0"/>
+              <w:left w:val="none" w:color="FFFFFF" w:sz="0"/>
+              <w:bottom w:val="none" w:color="FFFFFF" w:sz="0"/>
+              <w:right w:val="none" w:color="FFFFFF" w:sz="0"/>
+            </w:tcBorders>
+            <w:shd w:fill="E8F1F8" w:color="auto" w:val="clear"/>
+            <w:tcMar>
+              <w:top w:type="dxa" w:w="0"/>
+              <w:left w:type="dxa" w:w="200"/>
+              <w:bottom w:type="dxa" w:w="40"/>
+              <w:right w:type="dxa" w:w="200"/>
+            </w:tcMar>
+          </w:tcPr>
+          <w:p>
+            <w:pPr>
+              <w:keepNext/>
+              <w:spacing w:after="100" w:line="264"/>
+            </w:pPr>
+            <w:r>
+              <w:rPr>
+                <w:rFonts w:ascii="Cambria" w:cs="Cambria" w:eastAsia="Cambria" w:hAnsi="Cambria"/>
+                <w:color w:val="333333"/>
+                <w:sz w:val="21"/>
+                <w:szCs w:val="21"/>
+              </w:rPr>
+              <w:t xml:space="preserve">5.  s² + (D/m) s + K/m  =  s² + 2ζω</w:t>
+            </w:r>
+            <w:r>
+              <w:rPr>
+                <w:rFonts w:ascii="Cambria" w:cs="Cambria" w:eastAsia="Cambria" w:hAnsi="Cambria"/>
+                <w:color w:val="333333"/>
+                <w:sz w:val="21"/>
+                <w:szCs w:val="21"/>
+                <w:vertAlign w:val="subscript"/>
+              </w:rPr>
+              <w:t xml:space="preserve">n</w:t>
+            </w:r>
+            <w:r>
+              <w:rPr>
+                <w:rFonts w:ascii="Cambria" w:cs="Cambria" w:eastAsia="Cambria" w:hAnsi="Cambria"/>
+                <w:color w:val="333333"/>
+                <w:sz w:val="21"/>
+                <w:szCs w:val="21"/>
+              </w:rPr>
+              <w:t xml:space="preserve"> s + ω</w:t>
+            </w:r>
+            <w:r>
+              <w:rPr>
+                <w:rFonts w:ascii="Cambria" w:cs="Cambria" w:eastAsia="Cambria" w:hAnsi="Cambria"/>
+                <w:color w:val="333333"/>
+                <w:sz w:val="21"/>
+                <w:szCs w:val="21"/>
+                <w:vertAlign w:val="subscript"/>
+              </w:rPr>
+              <w:t xml:space="preserve">n</w:t>
+            </w:r>
+            <w:r>
+              <w:rPr>
+                <w:rFonts w:ascii="Cambria" w:cs="Cambria" w:eastAsia="Cambria" w:hAnsi="Cambria"/>
+                <w:color w:val="333333"/>
+                <w:sz w:val="21"/>
+                <w:szCs w:val="21"/>
+              </w:rPr>
+              <w:t xml:space="preserve">²    ⇒    ω</w:t>
+            </w:r>
+            <w:r>
+              <w:rPr>
+                <w:rFonts w:ascii="Cambria" w:cs="Cambria" w:eastAsia="Cambria" w:hAnsi="Cambria"/>
+                <w:color w:val="333333"/>
+                <w:sz w:val="21"/>
+                <w:szCs w:val="21"/>
+                <w:vertAlign w:val="subscript"/>
+              </w:rPr>
+              <w:t xml:space="preserve">n</w:t>
+            </w:r>
+            <w:r>
+              <w:rPr>
+                <w:rFonts w:ascii="Cambria" w:cs="Cambria" w:eastAsia="Cambria" w:hAnsi="Cambria"/>
+                <w:color w:val="333333"/>
+                <w:sz w:val="21"/>
+                <w:szCs w:val="21"/>
+              </w:rPr>
+              <w:t xml:space="preserve"> = √(K/m),   ζ = D/(2√(K m))</w:t>
+            </w:r>
+          </w:p>
+        </w:tc>
+      </w:tr>
+      <w:tr>
+        <w:trPr>
+          <w:cantSplit/>
+        </w:trPr>
+        <w:tc>
+          <w:tcPr>
+            <w:tcW w:type="dxa" w:w="9360"/>
+            <w:tcBorders>
+              <w:top w:val="none" w:color="FFFFFF" w:sz="0"/>
+              <w:left w:val="none" w:color="FFFFFF" w:sz="0"/>
+              <w:bottom w:val="none" w:color="FFFFFF" w:sz="0"/>
+              <w:right w:val="none" w:color="FFFFFF" w:sz="0"/>
+            </w:tcBorders>
+            <w:shd w:fill="E8F1F8" w:color="auto" w:val="clear"/>
+            <w:tcMar>
+              <w:top w:type="dxa" w:w="0"/>
+              <w:left w:type="dxa" w:w="200"/>
+              <w:bottom w:type="dxa" w:w="40"/>
+              <w:right w:type="dxa" w:w="200"/>
+            </w:tcMar>
+          </w:tcPr>
+          <w:p>
+            <w:pPr>
+              <w:keepNext/>
+              <w:spacing w:after="100" w:line="264"/>
+            </w:pPr>
+            <w:r>
+              <w:rPr>
+                <w:rFonts w:ascii="Cambria" w:cs="Cambria" w:eastAsia="Cambria" w:hAnsi="Cambria"/>
+                <w:color w:val="333333"/>
+                <w:sz w:val="21"/>
+                <w:szCs w:val="21"/>
+              </w:rPr>
+              <w:t xml:space="preserve">6.  K = 10, D = 2:   light (0.30 kg) ζ = 0.58;   heavy (2.09 kg) ζ = 0.22</w:t>
+            </w:r>
+          </w:p>
+        </w:tc>
+      </w:tr>
+      <w:tr>
+        <w:trPr>
+          <w:cantSplit/>
+        </w:trPr>
+        <w:tc>
+          <w:tcPr>
+            <w:tcW w:type="dxa" w:w="9360"/>
+            <w:tcBorders>
+              <w:top w:val="none" w:color="FFFFFF" w:sz="0"/>
+              <w:left w:val="none" w:color="FFFFFF" w:sz="0"/>
+              <w:bottom w:val="none" w:color="FFFFFF" w:sz="0"/>
+              <w:right w:val="none" w:color="FFFFFF" w:sz="0"/>
+            </w:tcBorders>
+            <w:shd w:fill="E8F1F8" w:color="auto" w:val="clear"/>
+            <w:tcMar>
+              <w:top w:type="dxa" w:w="0"/>
+              <w:left w:type="dxa" w:w="200"/>
               <w:bottom w:type="dxa" w:w="150"/>
               <w:right w:type="dxa" w:w="200"/>
             </w:tcMar>
@@ -14590,7 +15016,26 @@
                 <w:sz w:val="21"/>
                 <w:szCs w:val="21"/>
               </w:rPr>
-              <w:t xml:space="preserve">limit: K</w:t>
+              <w:t xml:space="preserve">7.  acceleration (τ = M J</w:t>
+            </w:r>
+            <w:r>
+              <w:rPr>
+                <w:rFonts w:ascii="Cambria" w:cs="Cambria" w:eastAsia="Cambria" w:hAnsi="Cambria"/>
+                <w:color w:val="333333"/>
+                <w:sz w:val="21"/>
+                <w:szCs w:val="21"/>
+                <w:vertAlign w:val="superscript"/>
+              </w:rPr>
+              <w:t xml:space="preserve">−1</w:t>
+            </w:r>
+            <w:r>
+              <w:rPr>
+                <w:rFonts w:ascii="Cambria" w:cs="Cambria" w:eastAsia="Cambria" w:hAnsi="Cambria"/>
+                <w:color w:val="333333"/>
+                <w:sz w:val="21"/>
+                <w:szCs w:val="21"/>
+              </w:rPr>
+              <w:t xml:space="preserve"> a):   G = 1/s²   ⇒   T = (K</w:t>
             </w:r>
             <w:r>
               <w:rPr>
@@ -14600,6 +15045,25 @@
                 <w:szCs w:val="21"/>
                 <w:vertAlign w:val="subscript"/>
               </w:rPr>
+              <w:t xml:space="preserve">d</w:t>
+            </w:r>
+            <w:r>
+              <w:rPr>
+                <w:rFonts w:ascii="Cambria" w:cs="Cambria" w:eastAsia="Cambria" w:hAnsi="Cambria"/>
+                <w:color w:val="333333"/>
+                <w:sz w:val="21"/>
+                <w:szCs w:val="21"/>
+              </w:rPr>
+              <w:t xml:space="preserve"> s + K</w:t>
+            </w:r>
+            <w:r>
+              <w:rPr>
+                <w:rFonts w:ascii="Cambria" w:cs="Cambria" w:eastAsia="Cambria" w:hAnsi="Cambria"/>
+                <w:color w:val="333333"/>
+                <w:sz w:val="21"/>
+                <w:szCs w:val="21"/>
+                <w:vertAlign w:val="subscript"/>
+              </w:rPr>
               <w:t xml:space="preserve">p</w:t>
             </w:r>
             <w:r>
@@ -14609,7 +15073,83 @@
                 <w:sz w:val="21"/>
                 <w:szCs w:val="21"/>
               </w:rPr>
-              <w:t xml:space="preserve">Δ² &lt; 0.55</w:t>
+              <w:t xml:space="preserve">)/(s² + K</w:t>
+            </w:r>
+            <w:r>
+              <w:rPr>
+                <w:rFonts w:ascii="Cambria" w:cs="Cambria" w:eastAsia="Cambria" w:hAnsi="Cambria"/>
+                <w:color w:val="333333"/>
+                <w:sz w:val="21"/>
+                <w:szCs w:val="21"/>
+                <w:vertAlign w:val="subscript"/>
+              </w:rPr>
+              <w:t xml:space="preserve">d</w:t>
+            </w:r>
+            <w:r>
+              <w:rPr>
+                <w:rFonts w:ascii="Cambria" w:cs="Cambria" w:eastAsia="Cambria" w:hAnsi="Cambria"/>
+                <w:color w:val="333333"/>
+                <w:sz w:val="21"/>
+                <w:szCs w:val="21"/>
+              </w:rPr>
+              <w:t xml:space="preserve"> s + K</w:t>
+            </w:r>
+            <w:r>
+              <w:rPr>
+                <w:rFonts w:ascii="Cambria" w:cs="Cambria" w:eastAsia="Cambria" w:hAnsi="Cambria"/>
+                <w:color w:val="333333"/>
+                <w:sz w:val="21"/>
+                <w:szCs w:val="21"/>
+                <w:vertAlign w:val="subscript"/>
+              </w:rPr>
+              <w:t xml:space="preserve">p</w:t>
+            </w:r>
+            <w:r>
+              <w:rPr>
+                <w:rFonts w:ascii="Cambria" w:cs="Cambria" w:eastAsia="Cambria" w:hAnsi="Cambria"/>
+                <w:color w:val="333333"/>
+                <w:sz w:val="21"/>
+                <w:szCs w:val="21"/>
+              </w:rPr>
+              <w:t xml:space="preserve">),   ζ = K</w:t>
+            </w:r>
+            <w:r>
+              <w:rPr>
+                <w:rFonts w:ascii="Cambria" w:cs="Cambria" w:eastAsia="Cambria" w:hAnsi="Cambria"/>
+                <w:color w:val="333333"/>
+                <w:sz w:val="21"/>
+                <w:szCs w:val="21"/>
+                <w:vertAlign w:val="subscript"/>
+              </w:rPr>
+              <w:t xml:space="preserve">d</w:t>
+            </w:r>
+            <w:r>
+              <w:rPr>
+                <w:rFonts w:ascii="Cambria" w:cs="Cambria" w:eastAsia="Cambria" w:hAnsi="Cambria"/>
+                <w:color w:val="333333"/>
+                <w:sz w:val="21"/>
+                <w:szCs w:val="21"/>
+              </w:rPr>
+              <w:t xml:space="preserve">/(2√K</w:t>
+            </w:r>
+            <w:r>
+              <w:rPr>
+                <w:rFonts w:ascii="Cambria" w:cs="Cambria" w:eastAsia="Cambria" w:hAnsi="Cambria"/>
+                <w:color w:val="333333"/>
+                <w:sz w:val="21"/>
+                <w:szCs w:val="21"/>
+                <w:vertAlign w:val="subscript"/>
+              </w:rPr>
+              <w:t xml:space="preserve">p</w:t>
+            </w:r>
+            <w:r>
+              <w:rPr>
+                <w:rFonts w:ascii="Cambria" w:cs="Cambria" w:eastAsia="Cambria" w:hAnsi="Cambria"/>
+                <w:color w:val="333333"/>
+                <w:sz w:val="21"/>
+                <w:szCs w:val="21"/>
+              </w:rPr>
+              <w:t xml:space="preserve">) on every axis</w:t>
             </w:r>
           </w:p>
         </w:tc>
@@ -14644,7 +15184,985 @@
           <w:sz w:val="22"/>
           <w:szCs w:val="22"/>
         </w:rPr>
-        <w:t xml:space="preserve"> Pre-lab Task P.4 steps Equation H.20 forward in time, with and without the D term. Lab 08's Tasks C.3 to C.5 measure the same growth on the arm and find the limit of Equation 8.7.</w:t>
+        <w:t xml:space="preserve"> Pre-lab Task P.3 gives the hand Lab 08's gains without the delay. Lab 08's Task C.1 builds the same controller on the two-joint arm, and Task C.6 turns its gains into a stiffness, m K</w:t>
+      </w:r>
+      <w:r>
+        <w:rPr>
+          <w:rFonts w:ascii="Cambria" w:cs="Cambria" w:eastAsia="Cambria" w:hAnsi="Cambria"/>
+          <w:color w:val="333333"/>
+          <w:sz w:val="22"/>
+          <w:szCs w:val="22"/>
+          <w:vertAlign w:val="subscript"/>
+        </w:rPr>
+        <w:t xml:space="preserve">p</w:t>
+      </w:r>
+      <w:r>
+        <w:rPr>
+          <w:rFonts w:ascii="Cambria" w:cs="Cambria" w:eastAsia="Cambria" w:hAnsi="Cambria"/>
+          <w:color w:val="333333"/>
+          <w:sz w:val="22"/>
+          <w:szCs w:val="22"/>
+        </w:rPr>
+        <w:t xml:space="preserve">.</w:t>
+      </w:r>
+    </w:p>
+    <w:p>
+      <w:pPr>
+        <w:spacing w:after="160" w:before="60" w:line="276"/>
+        <w:ind w:left="360"/>
+      </w:pPr>
+      <w:r>
+        <w:rPr>
+          <w:rFonts w:ascii="Georgia" w:cs="Georgia" w:eastAsia="Georgia" w:hAnsi="Georgia"/>
+          <w:b/>
+          <w:bCs/>
+          <w:color w:val="2E86AB"/>
+          <w:sz w:val="21"/>
+          <w:szCs w:val="21"/>
+        </w:rPr>
+        <w:t xml:space="preserve">Check 10. </w:t>
+      </w:r>
+      <w:r>
+        <w:rPr>
+          <w:rFonts w:ascii="Cambria" w:cs="Cambria" w:eastAsia="Cambria" w:hAnsi="Cambria"/>
+          <w:i/>
+          <w:iCs/>
+          <w:color w:val="333333"/>
+          <w:sz w:val="21"/>
+          <w:szCs w:val="21"/>
+        </w:rPr>
+        <w:t xml:space="preserve">With the force command and K = 10 N/m, which D gives the heavy axis ζ = 0.7? What is ζ on the light axis then?</w:t>
+      </w:r>
+    </w:p>
+    <w:p>
+      <w:pPr>
+        <w:keepNext/>
+        <w:spacing w:after="160" w:before="340"/>
+      </w:pPr>
+      <w:r>
+        <w:rPr>
+          <w:rFonts w:ascii="Georgia" w:cs="Georgia" w:eastAsia="Georgia" w:hAnsi="Georgia"/>
+          <w:b/>
+          <w:bCs/>
+          <w:color w:val="1B2A4A"/>
+          <w:sz w:val="32"/>
+          <w:szCs w:val="32"/>
+        </w:rPr>
+        <w:t xml:space="preserve">Board 11. The Hand With a Delay</w:t>
+      </w:r>
+    </w:p>
+    <w:p>
+      <w:pPr>
+        <w:keepNext w:val="false"/>
+        <w:spacing w:after="140" w:before="0" w:line="276"/>
+        <w:jc w:val="left"/>
+      </w:pPr>
+      <w:r>
+        <w:rPr>
+          <w:rFonts w:ascii="Cambria" w:cs="Cambria" w:eastAsia="Cambria" w:hAnsi="Cambria"/>
+          <w:color w:val="333333"/>
+          <w:sz w:val="22"/>
+          <w:szCs w:val="22"/>
+        </w:rPr>
+        <w:t xml:space="preserve">Vision reports the hand Δ late (notes Equation 8.1), so the controller acts on e(t − Δ). By Equation H.7, the delay multiplies the correction by e</w:t>
+      </w:r>
+      <w:r>
+        <w:rPr>
+          <w:rFonts w:ascii="Cambria" w:cs="Cambria" w:eastAsia="Cambria" w:hAnsi="Cambria"/>
+          <w:color w:val="333333"/>
+          <w:sz w:val="22"/>
+          <w:szCs w:val="22"/>
+          <w:vertAlign w:val="superscript"/>
+        </w:rPr>
+        <w:t xml:space="preserve">−sΔ</w:t>
+      </w:r>
+      <w:r>
+        <w:rPr>
+          <w:rFonts w:ascii="Cambria" w:cs="Cambria" w:eastAsia="Cambria" w:hAnsi="Cambria"/>
+          <w:color w:val="333333"/>
+          <w:sz w:val="22"/>
+          <w:szCs w:val="22"/>
+        </w:rPr>
+        <w:t xml:space="preserve">, and the denominator of the loop becomes</w:t>
+      </w:r>
+    </w:p>
+    <w:p>
+      <w:pPr>
+        <w:tabs>
+          <w:tab w:val="right" w:pos="9026"/>
+        </w:tabs>
+        <w:spacing w:after="150" w:before="120"/>
+        <w:ind w:left="360"/>
+      </w:pPr>
+      <w:r>
+        <w:rPr>
+          <w:rFonts w:ascii="Cambria" w:cs="Cambria" w:eastAsia="Cambria" w:hAnsi="Cambria"/>
+          <w:color w:val="333333"/>
+          <w:sz w:val="24"/>
+          <w:szCs w:val="24"/>
+        </w:rPr>
+        <w:t xml:space="preserve">s²  +  (K</w:t>
+      </w:r>
+      <w:r>
+        <w:rPr>
+          <w:rFonts w:ascii="Cambria" w:cs="Cambria" w:eastAsia="Cambria" w:hAnsi="Cambria"/>
+          <w:color w:val="333333"/>
+          <w:sz w:val="24"/>
+          <w:szCs w:val="24"/>
+          <w:vertAlign w:val="subscript"/>
+        </w:rPr>
+        <w:t xml:space="preserve">p</w:t>
+      </w:r>
+      <w:r>
+        <w:rPr>
+          <w:rFonts w:ascii="Cambria" w:cs="Cambria" w:eastAsia="Cambria" w:hAnsi="Cambria"/>
+          <w:color w:val="333333"/>
+          <w:sz w:val="24"/>
+          <w:szCs w:val="24"/>
+        </w:rPr>
+        <w:t xml:space="preserve"> + K</w:t>
+      </w:r>
+      <w:r>
+        <w:rPr>
+          <w:rFonts w:ascii="Cambria" w:cs="Cambria" w:eastAsia="Cambria" w:hAnsi="Cambria"/>
+          <w:color w:val="333333"/>
+          <w:sz w:val="24"/>
+          <w:szCs w:val="24"/>
+          <w:vertAlign w:val="subscript"/>
+        </w:rPr>
+        <w:t xml:space="preserve">d</w:t>
+      </w:r>
+      <w:r>
+        <w:rPr>
+          <w:rFonts w:ascii="Cambria" w:cs="Cambria" w:eastAsia="Cambria" w:hAnsi="Cambria"/>
+          <w:color w:val="333333"/>
+          <w:sz w:val="24"/>
+          <w:szCs w:val="24"/>
+        </w:rPr>
+        <w:t xml:space="preserve"> s) e</w:t>
+      </w:r>
+      <w:r>
+        <w:rPr>
+          <w:rFonts w:ascii="Cambria" w:cs="Cambria" w:eastAsia="Cambria" w:hAnsi="Cambria"/>
+          <w:color w:val="333333"/>
+          <w:sz w:val="24"/>
+          <w:szCs w:val="24"/>
+          <w:vertAlign w:val="superscript"/>
+        </w:rPr>
+        <w:t xml:space="preserve">−sΔ</w:t>
+      </w:r>
+      <w:r>
+        <w:rPr>
+          <w:rFonts w:ascii="Cambria" w:cs="Cambria" w:eastAsia="Cambria" w:hAnsi="Cambria"/>
+          <w:color w:val="333333"/>
+          <w:sz w:val="24"/>
+          <w:szCs w:val="24"/>
+        </w:rPr>
+        <w:t xml:space="preserve">  =  0</w:t>
+      </w:r>
+      <w:r>
+        <w:rPr>
+          <w:rFonts w:ascii="Cambria" w:cs="Cambria" w:eastAsia="Cambria" w:hAnsi="Cambria"/>
+          <w:color w:val="666666"/>
+          <w:sz w:val="20"/>
+          <w:szCs w:val="20"/>
+        </w:rPr>
+        <w:t xml:space="preserve">	</w:t>
+        <w:t xml:space="preserve">(H.25)</w:t>
+      </w:r>
+    </w:p>
+    <w:p>
+      <w:pPr>
+        <w:keepNext w:val="false"/>
+        <w:spacing w:after="140" w:before="0" w:line="276"/>
+        <w:jc w:val="left"/>
+      </w:pPr>
+      <w:r>
+        <w:rPr>
+          <w:rFonts w:ascii="Cambria" w:cs="Cambria" w:eastAsia="Cambria" w:hAnsi="Cambria"/>
+          <w:color w:val="333333"/>
+          <w:sz w:val="22"/>
+          <w:szCs w:val="22"/>
+        </w:rPr>
+        <w:t xml:space="preserve">This is the characteristic equation of the notes' Equation 8.4. Figure 9A shows why the delay matters: a correction that arrives Δ late has a part in step with the velocity, and that part pushes with the motion. For central vision the effective delay is Δ = 155 ms (notes §3.2). Equation H.25 is not a polynomial: e</w:t>
+      </w:r>
+      <w:r>
+        <w:rPr>
+          <w:rFonts w:ascii="Cambria" w:cs="Cambria" w:eastAsia="Cambria" w:hAnsi="Cambria"/>
+          <w:color w:val="333333"/>
+          <w:sz w:val="22"/>
+          <w:szCs w:val="22"/>
+          <w:vertAlign w:val="superscript"/>
+        </w:rPr>
+        <w:t xml:space="preserve">−sΔ</w:t>
+      </w:r>
+      <w:r>
+        <w:rPr>
+          <w:rFonts w:ascii="Cambria" w:cs="Cambria" w:eastAsia="Cambria" w:hAnsi="Cambria"/>
+          <w:color w:val="333333"/>
+          <w:sz w:val="22"/>
+          <w:szCs w:val="22"/>
+        </w:rPr>
+        <w:t xml:space="preserve"> gives it infinitely many roots, and the quadratic formula no longer applies. The root that matters most is the one nearest the vertical axis, the slowest (Board 4). The notes find it with the Lambert W function (Equation 8.5) or numerically.</w:t>
+      </w:r>
+    </w:p>
+    <w:p>
+      <w:pPr>
+        <w:keepNext w:val="false"/>
+        <w:spacing w:after="140" w:before="0" w:line="276"/>
+        <w:jc w:val="left"/>
+      </w:pPr>
+      <w:r>
+        <w:rPr>
+          <w:rFonts w:ascii="Cambria" w:cs="Cambria" w:eastAsia="Cambria" w:hAnsi="Cambria"/>
+          <w:color w:val="333333"/>
+          <w:sz w:val="22"/>
+          <w:szCs w:val="22"/>
+        </w:rPr>
+        <w:t xml:space="preserve">Take the gains of the notes' Figure 4, κ = K</w:t>
+      </w:r>
+      <w:r>
+        <w:rPr>
+          <w:rFonts w:ascii="Cambria" w:cs="Cambria" w:eastAsia="Cambria" w:hAnsi="Cambria"/>
+          <w:color w:val="333333"/>
+          <w:sz w:val="22"/>
+          <w:szCs w:val="22"/>
+          <w:vertAlign w:val="subscript"/>
+        </w:rPr>
+        <w:t xml:space="preserve">p</w:t>
+      </w:r>
+      <w:r>
+        <w:rPr>
+          <w:rFonts w:ascii="Cambria" w:cs="Cambria" w:eastAsia="Cambria" w:hAnsi="Cambria"/>
+          <w:color w:val="333333"/>
+          <w:sz w:val="22"/>
+          <w:szCs w:val="22"/>
+        </w:rPr>
+        <w:t xml:space="preserve">Δ² = 0.2 and δ = K</w:t>
+      </w:r>
+      <w:r>
+        <w:rPr>
+          <w:rFonts w:ascii="Cambria" w:cs="Cambria" w:eastAsia="Cambria" w:hAnsi="Cambria"/>
+          <w:color w:val="333333"/>
+          <w:sz w:val="22"/>
+          <w:szCs w:val="22"/>
+          <w:vertAlign w:val="subscript"/>
+        </w:rPr>
+        <w:t xml:space="preserve">d</w:t>
+      </w:r>
+      <w:r>
+        <w:rPr>
+          <w:rFonts w:ascii="Cambria" w:cs="Cambria" w:eastAsia="Cambria" w:hAnsi="Cambria"/>
+          <w:color w:val="333333"/>
+          <w:sz w:val="22"/>
+          <w:szCs w:val="22"/>
+        </w:rPr>
+        <w:t xml:space="preserve">Δ = 0.9, so K</w:t>
+      </w:r>
+      <w:r>
+        <w:rPr>
+          <w:rFonts w:ascii="Cambria" w:cs="Cambria" w:eastAsia="Cambria" w:hAnsi="Cambria"/>
+          <w:color w:val="333333"/>
+          <w:sz w:val="22"/>
+          <w:szCs w:val="22"/>
+          <w:vertAlign w:val="subscript"/>
+        </w:rPr>
+        <w:t xml:space="preserve">p</w:t>
+      </w:r>
+      <w:r>
+        <w:rPr>
+          <w:rFonts w:ascii="Cambria" w:cs="Cambria" w:eastAsia="Cambria" w:hAnsi="Cambria"/>
+          <w:color w:val="333333"/>
+          <w:sz w:val="22"/>
+          <w:szCs w:val="22"/>
+        </w:rPr>
+        <w:t xml:space="preserve"> = 8.3 s</w:t>
+      </w:r>
+      <w:r>
+        <w:rPr>
+          <w:rFonts w:ascii="Cambria" w:cs="Cambria" w:eastAsia="Cambria" w:hAnsi="Cambria"/>
+          <w:color w:val="333333"/>
+          <w:sz w:val="22"/>
+          <w:szCs w:val="22"/>
+          <w:vertAlign w:val="superscript"/>
+        </w:rPr>
+        <w:t xml:space="preserve">−2</w:t>
+      </w:r>
+      <w:r>
+        <w:rPr>
+          <w:rFonts w:ascii="Cambria" w:cs="Cambria" w:eastAsia="Cambria" w:hAnsi="Cambria"/>
+          <w:color w:val="333333"/>
+          <w:sz w:val="22"/>
+          <w:szCs w:val="22"/>
+        </w:rPr>
+        <w:t xml:space="preserve"> and K</w:t>
+      </w:r>
+      <w:r>
+        <w:rPr>
+          <w:rFonts w:ascii="Cambria" w:cs="Cambria" w:eastAsia="Cambria" w:hAnsi="Cambria"/>
+          <w:color w:val="333333"/>
+          <w:sz w:val="22"/>
+          <w:szCs w:val="22"/>
+          <w:vertAlign w:val="subscript"/>
+        </w:rPr>
+        <w:t xml:space="preserve">d</w:t>
+      </w:r>
+      <w:r>
+        <w:rPr>
+          <w:rFonts w:ascii="Cambria" w:cs="Cambria" w:eastAsia="Cambria" w:hAnsi="Cambria"/>
+          <w:color w:val="333333"/>
+          <w:sz w:val="22"/>
+          <w:szCs w:val="22"/>
+        </w:rPr>
+        <w:t xml:space="preserve"> = 5.8 s</w:t>
+      </w:r>
+      <w:r>
+        <w:rPr>
+          <w:rFonts w:ascii="Cambria" w:cs="Cambria" w:eastAsia="Cambria" w:hAnsi="Cambria"/>
+          <w:color w:val="333333"/>
+          <w:sz w:val="22"/>
+          <w:szCs w:val="22"/>
+          <w:vertAlign w:val="superscript"/>
+        </w:rPr>
+        <w:t xml:space="preserve">−1</w:t>
+      </w:r>
+      <w:r>
+        <w:rPr>
+          <w:rFonts w:ascii="Cambria" w:cs="Cambria" w:eastAsia="Cambria" w:hAnsi="Cambria"/>
+          <w:color w:val="333333"/>
+          <w:sz w:val="22"/>
+          <w:szCs w:val="22"/>
+        </w:rPr>
+        <w:t xml:space="preserve">. Without the delay, s² + 5.8 s + 8.3 has ζ = 1.01. From a 1 cm offset, the error falls smoothly to zero (Figure 9B).</w:t>
+      </w:r>
+    </w:p>
+    <w:p>
+      <w:pPr>
+        <w:keepNext w:val="false"/>
+        <w:spacing w:after="140" w:before="0" w:line="276"/>
+        <w:jc w:val="left"/>
+      </w:pPr>
+      <w:r>
+        <w:rPr>
+          <w:rFonts w:ascii="Cambria" w:cs="Cambria" w:eastAsia="Cambria" w:hAnsi="Cambria"/>
+          <w:color w:val="333333"/>
+          <w:sz w:val="22"/>
+          <w:szCs w:val="22"/>
+        </w:rPr>
+        <w:t xml:space="preserve">With the delay, the root nearest the vertical axis is −1.86 ± 7.29i: 1.2 swings per second, with a time constant of 0.54 s. The error falls faster at first, because the braking from the velocity term arrives late. It then stalls once every 2π/7.29 = 0.86 s, and shrinks by a factor e every 1/1.86 = 0.54 s (Figure 9B). The same root sets the swings of the notes' Figure 4B.</w:t>
+      </w:r>
+    </w:p>
+    <w:p>
+      <w:pPr>
+        <w:keepNext w:val="false"/>
+        <w:spacing w:after="140" w:before="0" w:line="276"/>
+        <w:jc w:val="left"/>
+      </w:pPr>
+      <w:r>
+        <w:rPr>
+          <w:rFonts w:ascii="Cambria" w:cs="Cambria" w:eastAsia="Cambria" w:hAnsi="Cambria"/>
+          <w:color w:val="333333"/>
+          <w:sz w:val="22"/>
+          <w:szCs w:val="22"/>
+        </w:rPr>
+        <w:t xml:space="preserve">Now raise the gains toward the edge of the notes' Equation 8.7, to κ = 0.5 and δ = 0.95. Without the delay, these gains give ζ = 0.67 and an overshoot of 6%. With the delay, the root moves to −0.22 ± 6.96i, close to the vertical axis (Figure 3E). Its time constant is 4.5 s, so the error swings across zero for about 18 s before the swings are down to 2% (Figure 9B).</w:t>
+      </w:r>
+    </w:p>
+    <w:p>
+      <w:pPr>
+        <w:keepNext w:val="false"/>
+        <w:spacing w:after="140" w:before="0" w:line="276"/>
+        <w:jc w:val="left"/>
+      </w:pPr>
+      <w:r>
+        <w:rPr>
+          <w:rFonts w:ascii="Cambria" w:cs="Cambria" w:eastAsia="Cambria" w:hAnsi="Cambria"/>
+          <w:color w:val="333333"/>
+          <w:sz w:val="22"/>
+          <w:szCs w:val="22"/>
+        </w:rPr>
+        <w:t xml:space="preserve">On the cart, a larger K</w:t>
+      </w:r>
+      <w:r>
+        <w:rPr>
+          <w:rFonts w:ascii="Cambria" w:cs="Cambria" w:eastAsia="Cambria" w:hAnsi="Cambria"/>
+          <w:color w:val="333333"/>
+          <w:sz w:val="22"/>
+          <w:szCs w:val="22"/>
+          <w:vertAlign w:val="subscript"/>
+        </w:rPr>
+        <w:t xml:space="preserve">p</w:t>
+      </w:r>
+      <w:r>
+        <w:rPr>
+          <w:rFonts w:ascii="Cambria" w:cs="Cambria" w:eastAsia="Cambria" w:hAnsi="Cambria"/>
+          <w:color w:val="333333"/>
+          <w:sz w:val="22"/>
+          <w:szCs w:val="22"/>
+        </w:rPr>
+        <w:t xml:space="preserve"> only added overshoot. Here the delay sets a limit, K</w:t>
+      </w:r>
+      <w:r>
+        <w:rPr>
+          <w:rFonts w:ascii="Cambria" w:cs="Cambria" w:eastAsia="Cambria" w:hAnsi="Cambria"/>
+          <w:color w:val="333333"/>
+          <w:sz w:val="22"/>
+          <w:szCs w:val="22"/>
+          <w:vertAlign w:val="subscript"/>
+        </w:rPr>
+        <w:t xml:space="preserve">p</w:t>
+      </w:r>
+      <w:r>
+        <w:rPr>
+          <w:rFonts w:ascii="Cambria" w:cs="Cambria" w:eastAsia="Cambria" w:hAnsi="Cambria"/>
+          <w:color w:val="333333"/>
+          <w:sz w:val="22"/>
+          <w:szCs w:val="22"/>
+        </w:rPr>
+        <w:t xml:space="preserve">Δ² &lt; 0.55 (notes Equation 8.7): K</w:t>
+      </w:r>
+      <w:r>
+        <w:rPr>
+          <w:rFonts w:ascii="Cambria" w:cs="Cambria" w:eastAsia="Cambria" w:hAnsi="Cambria"/>
+          <w:color w:val="333333"/>
+          <w:sz w:val="22"/>
+          <w:szCs w:val="22"/>
+          <w:vertAlign w:val="subscript"/>
+        </w:rPr>
+        <w:t xml:space="preserve">p</w:t>
+      </w:r>
+      <w:r>
+        <w:rPr>
+          <w:rFonts w:ascii="Cambria" w:cs="Cambria" w:eastAsia="Cambria" w:hAnsi="Cambria"/>
+          <w:color w:val="333333"/>
+          <w:sz w:val="22"/>
+          <w:szCs w:val="22"/>
+        </w:rPr>
+        <w:t xml:space="preserve"> &lt; 22.9 s</w:t>
+      </w:r>
+      <w:r>
+        <w:rPr>
+          <w:rFonts w:ascii="Cambria" w:cs="Cambria" w:eastAsia="Cambria" w:hAnsi="Cambria"/>
+          <w:color w:val="333333"/>
+          <w:sz w:val="22"/>
+          <w:szCs w:val="22"/>
+          <w:vertAlign w:val="superscript"/>
+        </w:rPr>
+        <w:t xml:space="preserve">−2</w:t>
+      </w:r>
+      <w:r>
+        <w:rPr>
+          <w:rFonts w:ascii="Cambria" w:cs="Cambria" w:eastAsia="Cambria" w:hAnsi="Cambria"/>
+          <w:color w:val="333333"/>
+          <w:sz w:val="22"/>
+          <w:szCs w:val="22"/>
+        </w:rPr>
+        <w:t xml:space="preserve"> at 155 ms. Figure 9C marks both loops inside the stable region of the notes' Figure 5C.</w:t>
+      </w:r>
+    </w:p>
+    <w:p>
+      <w:pPr>
+        <w:keepNext/>
+        <w:keepLines/>
+        <w:spacing w:after="80" w:before="120"/>
+        <w:jc w:val="center"/>
+      </w:pPr>
+      <w:r>
+        <w:drawing>
+          <wp:inline distT="0" distB="0" distL="0" distR="0">
+            <wp:extent cx="5715000" cy="2095500"/>
+            <wp:effectExtent t="0" r="0" b="0" l="0"/>
+            <wp:docPr id="1" name="" descr="" title=""/>
+            <wp:cNvGraphicFramePr>
+              <a:graphicFrameLocks xmlns:a="http://schemas.openxmlformats.org/drawingml/2006/main" noChangeAspect="1"/>
+            </wp:cNvGraphicFramePr>
+            <a:graphic xmlns:a="http://schemas.openxmlformats.org/drawingml/2006/main">
+              <a:graphicData uri="http://schemas.openxmlformats.org/drawingml/2006/picture">
+                <pic:pic xmlns:pic="http://schemas.openxmlformats.org/drawingml/2006/picture">
+                  <pic:nvPicPr>
+                    <pic:cNvPr id="0" name="" descr=""/>
+                    <pic:cNvPicPr>
+                      <a:picLocks noChangeAspect="1" noChangeArrowheads="1"/>
+                    </pic:cNvPicPr>
+                  </pic:nvPicPr>
+                  <pic:blipFill>
+                    <a:blip r:embed="rId17" cstate="none"/>
+                    <a:srcRect/>
+                    <a:stretch>
+                      <a:fillRect/>
+                    </a:stretch>
+                  </pic:blipFill>
+                  <pic:spPr bwMode="auto">
+                    <a:xfrm>
+                      <a:off x="0" y="0"/>
+                      <a:ext cx="5715000" cy="2095500"/>
+                    </a:xfrm>
+                    <a:prstGeom prst="rect">
+                      <a:avLst/>
+                    </a:prstGeom>
+                  </pic:spPr>
+                </pic:pic>
+              </a:graphicData>
+            </a:graphic>
+          </wp:inline>
+        </w:drawing>
+      </w:r>
+    </w:p>
+    <w:p>
+      <w:pPr>
+        <w:keepNext w:val="false"/>
+        <w:keepLines/>
+        <w:spacing w:after="200" w:before="0" w:line="264"/>
+      </w:pPr>
+      <w:r>
+        <w:rPr>
+          <w:rFonts w:ascii="Cambria" w:cs="Cambria" w:eastAsia="Cambria" w:hAnsi="Cambria"/>
+          <w:b/>
+          <w:bCs/>
+          <w:color w:val="333333"/>
+          <w:sz w:val="19"/>
+          <w:szCs w:val="19"/>
+        </w:rPr>
+        <w:t xml:space="preserve">Figure 9. </w:t>
+      </w:r>
+      <w:r>
+        <w:rPr>
+          <w:rFonts w:ascii="Cambria" w:cs="Cambria" w:eastAsia="Cambria" w:hAnsi="Cambria"/>
+          <w:color w:val="333333"/>
+          <w:sz w:val="19"/>
+          <w:szCs w:val="19"/>
+        </w:rPr>
+        <w:t xml:space="preserve">The hand with a delay, along one axis; κ = K</w:t>
+      </w:r>
+      <w:r>
+        <w:rPr>
+          <w:rFonts w:ascii="Cambria" w:cs="Cambria" w:eastAsia="Cambria" w:hAnsi="Cambria"/>
+          <w:color w:val="333333"/>
+          <w:sz w:val="19"/>
+          <w:szCs w:val="19"/>
+          <w:vertAlign w:val="subscript"/>
+        </w:rPr>
+        <w:t xml:space="preserve">p</w:t>
+      </w:r>
+      <w:r>
+        <w:rPr>
+          <w:rFonts w:ascii="Cambria" w:cs="Cambria" w:eastAsia="Cambria" w:hAnsi="Cambria"/>
+          <w:color w:val="333333"/>
+          <w:sz w:val="19"/>
+          <w:szCs w:val="19"/>
+        </w:rPr>
+        <w:t xml:space="preserve">Δ² and δ = K</w:t>
+      </w:r>
+      <w:r>
+        <w:rPr>
+          <w:rFonts w:ascii="Cambria" w:cs="Cambria" w:eastAsia="Cambria" w:hAnsi="Cambria"/>
+          <w:color w:val="333333"/>
+          <w:sz w:val="19"/>
+          <w:szCs w:val="19"/>
+          <w:vertAlign w:val="subscript"/>
+        </w:rPr>
+        <w:t xml:space="preserve">d</w:t>
+      </w:r>
+      <w:r>
+        <w:rPr>
+          <w:rFonts w:ascii="Cambria" w:cs="Cambria" w:eastAsia="Cambria" w:hAnsi="Cambria"/>
+          <w:color w:val="333333"/>
+          <w:sz w:val="19"/>
+          <w:szCs w:val="19"/>
+        </w:rPr>
+        <w:t xml:space="preserve">Δ, with Δ = 155 ms. A: a swing of the error at ω = √K</w:t>
+      </w:r>
+      <w:r>
+        <w:rPr>
+          <w:rFonts w:ascii="Cambria" w:cs="Cambria" w:eastAsia="Cambria" w:hAnsi="Cambria"/>
+          <w:color w:val="333333"/>
+          <w:sz w:val="19"/>
+          <w:szCs w:val="19"/>
+          <w:vertAlign w:val="subscript"/>
+        </w:rPr>
+        <w:t xml:space="preserve">p</w:t>
+      </w:r>
+      <w:r>
+        <w:rPr>
+          <w:rFonts w:ascii="Cambria" w:cs="Cambria" w:eastAsia="Cambria" w:hAnsi="Cambria"/>
+          <w:color w:val="333333"/>
+          <w:sz w:val="19"/>
+          <w:szCs w:val="19"/>
+        </w:rPr>
+        <w:t xml:space="preserve"> (K</w:t>
+      </w:r>
+      <w:r>
+        <w:rPr>
+          <w:rFonts w:ascii="Cambria" w:cs="Cambria" w:eastAsia="Cambria" w:hAnsi="Cambria"/>
+          <w:color w:val="333333"/>
+          <w:sz w:val="19"/>
+          <w:szCs w:val="19"/>
+          <w:vertAlign w:val="subscript"/>
+        </w:rPr>
+        <w:t xml:space="preserve">p</w:t>
+      </w:r>
+      <w:r>
+        <w:rPr>
+          <w:rFonts w:ascii="Cambria" w:cs="Cambria" w:eastAsia="Cambria" w:hAnsi="Cambria"/>
+          <w:color w:val="333333"/>
+          <w:sz w:val="19"/>
+          <w:szCs w:val="19"/>
+        </w:rPr>
+        <w:t xml:space="preserve"> = 8.3 s</w:t>
+      </w:r>
+      <w:r>
+        <w:rPr>
+          <w:rFonts w:ascii="Cambria" w:cs="Cambria" w:eastAsia="Cambria" w:hAnsi="Cambria"/>
+          <w:color w:val="333333"/>
+          <w:sz w:val="19"/>
+          <w:szCs w:val="19"/>
+          <w:vertAlign w:val="superscript"/>
+        </w:rPr>
+        <w:t xml:space="preserve">−2</w:t>
+      </w:r>
+      <w:r>
+        <w:rPr>
+          <w:rFonts w:ascii="Cambria" w:cs="Cambria" w:eastAsia="Cambria" w:hAnsi="Cambria"/>
+          <w:color w:val="333333"/>
+          <w:sz w:val="19"/>
+          <w:szCs w:val="19"/>
+        </w:rPr>
+        <w:t xml:space="preserve">), the correction that opposes it on time (dotted) and the same correction Δ late (solid). The late correction is the on-time one scaled by cos ωΔ, plus a part in step with the velocity (dashed) that pushes with the motion on every cycle. B: a PD acceleration command from a 1 cm offset, with and without the delay. C: the gains for which the delayed loop is stable (notes Figure 5C); dot: κ = 0.2, δ = 0.9; square: κ = 0.5, δ = 0.95; circle: the largest stable κ.</w:t>
+      </w:r>
+    </w:p>
+    <w:tbl>
+      <w:tblPr>
+        <w:tblW w:type="dxa" w:w="9360"/>
+        <w:tblBorders>
+          <w:top w:val="none"/>
+          <w:left w:val="none"/>
+          <w:bottom w:val="none"/>
+          <w:right w:val="none"/>
+          <w:insideH w:val="none"/>
+          <w:insideV w:val="none"/>
+        </w:tblBorders>
+      </w:tblPr>
+      <w:tblGrid>
+        <w:gridCol w:w="9360"/>
+      </w:tblGrid>
+      <w:tr>
+        <w:trPr>
+          <w:cantSplit/>
+        </w:trPr>
+        <w:tc>
+          <w:tcPr>
+            <w:tcW w:type="dxa" w:w="9360"/>
+            <w:tcBorders>
+              <w:top w:val="none" w:color="FFFFFF" w:sz="0"/>
+              <w:left w:val="none" w:color="FFFFFF" w:sz="0"/>
+              <w:bottom w:val="none" w:color="FFFFFF" w:sz="0"/>
+              <w:right w:val="none" w:color="FFFFFF" w:sz="0"/>
+            </w:tcBorders>
+            <w:shd w:fill="E8F1F8" w:color="auto" w:val="clear"/>
+            <w:tcMar>
+              <w:top w:type="dxa" w:w="150"/>
+              <w:left w:type="dxa" w:w="200"/>
+              <w:bottom w:type="dxa" w:w="40"/>
+              <w:right w:type="dxa" w:w="200"/>
+            </w:tcMar>
+          </w:tcPr>
+          <w:p>
+            <w:pPr>
+              <w:keepNext/>
+              <w:spacing w:after="80"/>
+            </w:pPr>
+            <w:r>
+              <w:rPr>
+                <w:rFonts w:ascii="Georgia" w:cs="Georgia" w:eastAsia="Georgia" w:hAnsi="Georgia"/>
+                <w:b/>
+                <w:bCs/>
+                <w:color w:val="1B2A4A"/>
+                <w:sz w:val="22"/>
+                <w:szCs w:val="22"/>
+              </w:rPr>
+              <w:t xml:space="preserve">On the board</w:t>
+            </w:r>
+          </w:p>
+        </w:tc>
+      </w:tr>
+      <w:tr>
+        <w:trPr>
+          <w:cantSplit/>
+        </w:trPr>
+        <w:tc>
+          <w:tcPr>
+            <w:tcW w:type="dxa" w:w="9360"/>
+            <w:tcBorders>
+              <w:top w:val="none" w:color="FFFFFF" w:sz="0"/>
+              <w:left w:val="none" w:color="FFFFFF" w:sz="0"/>
+              <w:bottom w:val="none" w:color="FFFFFF" w:sz="0"/>
+              <w:right w:val="none" w:color="FFFFFF" w:sz="0"/>
+            </w:tcBorders>
+            <w:shd w:fill="E8F1F8" w:color="auto" w:val="clear"/>
+            <w:tcMar>
+              <w:top w:type="dxa" w:w="0"/>
+              <w:left w:type="dxa" w:w="200"/>
+              <w:bottom w:type="dxa" w:w="40"/>
+              <w:right w:type="dxa" w:w="200"/>
+            </w:tcMar>
+          </w:tcPr>
+          <w:p>
+            <w:pPr>
+              <w:keepNext/>
+              <w:spacing w:after="100" w:line="264"/>
+            </w:pPr>
+            <w:r>
+              <w:rPr>
+                <w:rFonts w:ascii="Cambria" w:cs="Cambria" w:eastAsia="Cambria" w:hAnsi="Cambria"/>
+                <w:color w:val="333333"/>
+                <w:sz w:val="21"/>
+                <w:szCs w:val="21"/>
+              </w:rPr>
+              <w:t xml:space="preserve">the controller sees e(t − Δ):    e(t − Δ) → e</w:t>
+            </w:r>
+            <w:r>
+              <w:rPr>
+                <w:rFonts w:ascii="Cambria" w:cs="Cambria" w:eastAsia="Cambria" w:hAnsi="Cambria"/>
+                <w:color w:val="333333"/>
+                <w:sz w:val="21"/>
+                <w:szCs w:val="21"/>
+                <w:vertAlign w:val="superscript"/>
+              </w:rPr>
+              <w:t xml:space="preserve">−sΔ</w:t>
+            </w:r>
+            <w:r>
+              <w:rPr>
+                <w:rFonts w:ascii="Cambria" w:cs="Cambria" w:eastAsia="Cambria" w:hAnsi="Cambria"/>
+                <w:color w:val="333333"/>
+                <w:sz w:val="21"/>
+                <w:szCs w:val="21"/>
+              </w:rPr>
+              <w:t xml:space="preserve"> E(s)    ⇒    s² + (K</w:t>
+            </w:r>
+            <w:r>
+              <w:rPr>
+                <w:rFonts w:ascii="Cambria" w:cs="Cambria" w:eastAsia="Cambria" w:hAnsi="Cambria"/>
+                <w:color w:val="333333"/>
+                <w:sz w:val="21"/>
+                <w:szCs w:val="21"/>
+                <w:vertAlign w:val="subscript"/>
+              </w:rPr>
+              <w:t xml:space="preserve">p</w:t>
+            </w:r>
+            <w:r>
+              <w:rPr>
+                <w:rFonts w:ascii="Cambria" w:cs="Cambria" w:eastAsia="Cambria" w:hAnsi="Cambria"/>
+                <w:color w:val="333333"/>
+                <w:sz w:val="21"/>
+                <w:szCs w:val="21"/>
+              </w:rPr>
+              <w:t xml:space="preserve"> + K</w:t>
+            </w:r>
+            <w:r>
+              <w:rPr>
+                <w:rFonts w:ascii="Cambria" w:cs="Cambria" w:eastAsia="Cambria" w:hAnsi="Cambria"/>
+                <w:color w:val="333333"/>
+                <w:sz w:val="21"/>
+                <w:szCs w:val="21"/>
+                <w:vertAlign w:val="subscript"/>
+              </w:rPr>
+              <w:t xml:space="preserve">d</w:t>
+            </w:r>
+            <w:r>
+              <w:rPr>
+                <w:rFonts w:ascii="Cambria" w:cs="Cambria" w:eastAsia="Cambria" w:hAnsi="Cambria"/>
+                <w:color w:val="333333"/>
+                <w:sz w:val="21"/>
+                <w:szCs w:val="21"/>
+              </w:rPr>
+              <w:t xml:space="preserve"> s) e</w:t>
+            </w:r>
+            <w:r>
+              <w:rPr>
+                <w:rFonts w:ascii="Cambria" w:cs="Cambria" w:eastAsia="Cambria" w:hAnsi="Cambria"/>
+                <w:color w:val="333333"/>
+                <w:sz w:val="21"/>
+                <w:szCs w:val="21"/>
+                <w:vertAlign w:val="superscript"/>
+              </w:rPr>
+              <w:t xml:space="preserve">−sΔ</w:t>
+            </w:r>
+            <w:r>
+              <w:rPr>
+                <w:rFonts w:ascii="Cambria" w:cs="Cambria" w:eastAsia="Cambria" w:hAnsi="Cambria"/>
+                <w:color w:val="333333"/>
+                <w:sz w:val="21"/>
+                <w:szCs w:val="21"/>
+              </w:rPr>
+              <w:t xml:space="preserve"> = 0</w:t>
+            </w:r>
+          </w:p>
+        </w:tc>
+      </w:tr>
+      <w:tr>
+        <w:trPr>
+          <w:cantSplit/>
+        </w:trPr>
+        <w:tc>
+          <w:tcPr>
+            <w:tcW w:type="dxa" w:w="9360"/>
+            <w:tcBorders>
+              <w:top w:val="none" w:color="FFFFFF" w:sz="0"/>
+              <w:left w:val="none" w:color="FFFFFF" w:sz="0"/>
+              <w:bottom w:val="none" w:color="FFFFFF" w:sz="0"/>
+              <w:right w:val="none" w:color="FFFFFF" w:sz="0"/>
+            </w:tcBorders>
+            <w:shd w:fill="E8F1F8" w:color="auto" w:val="clear"/>
+            <w:tcMar>
+              <w:top w:type="dxa" w:w="0"/>
+              <w:left w:type="dxa" w:w="200"/>
+              <w:bottom w:type="dxa" w:w="40"/>
+              <w:right w:type="dxa" w:w="200"/>
+            </w:tcMar>
+          </w:tcPr>
+          <w:p>
+            <w:pPr>
+              <w:keepNext/>
+              <w:spacing w:after="100" w:line="264"/>
+            </w:pPr>
+            <w:r>
+              <w:rPr>
+                <w:rFonts w:ascii="Cambria" w:cs="Cambria" w:eastAsia="Cambria" w:hAnsi="Cambria"/>
+                <w:color w:val="333333"/>
+                <w:sz w:val="21"/>
+                <w:szCs w:val="21"/>
+              </w:rPr>
+              <w:t xml:space="preserve">not a polynomial: infinitely many roots; the rightmost one decides (notes Eq. 8.5, 8.7)</w:t>
+            </w:r>
+          </w:p>
+        </w:tc>
+      </w:tr>
+      <w:tr>
+        <w:trPr>
+          <w:cantSplit/>
+        </w:trPr>
+        <w:tc>
+          <w:tcPr>
+            <w:tcW w:type="dxa" w:w="9360"/>
+            <w:tcBorders>
+              <w:top w:val="none" w:color="FFFFFF" w:sz="0"/>
+              <w:left w:val="none" w:color="FFFFFF" w:sz="0"/>
+              <w:bottom w:val="none" w:color="FFFFFF" w:sz="0"/>
+              <w:right w:val="none" w:color="FFFFFF" w:sz="0"/>
+            </w:tcBorders>
+            <w:shd w:fill="E8F1F8" w:color="auto" w:val="clear"/>
+            <w:tcMar>
+              <w:top w:type="dxa" w:w="0"/>
+              <w:left w:type="dxa" w:w="200"/>
+              <w:bottom w:type="dxa" w:w="40"/>
+              <w:right w:type="dxa" w:w="200"/>
+            </w:tcMar>
+          </w:tcPr>
+          <w:p>
+            <w:pPr>
+              <w:keepNext/>
+              <w:spacing w:after="100" w:line="264"/>
+            </w:pPr>
+            <w:r>
+              <w:rPr>
+                <w:rFonts w:ascii="Cambria" w:cs="Cambria" w:eastAsia="Cambria" w:hAnsi="Cambria"/>
+                <w:color w:val="333333"/>
+                <w:sz w:val="21"/>
+                <w:szCs w:val="21"/>
+              </w:rPr>
+              <w:t xml:space="preserve">κ = 0.2, δ = 0.9, Δ = 155 ms:   no delay ζ = 1.01;   with delay  s = −1.86 ± 7.29i</w:t>
+            </w:r>
+          </w:p>
+        </w:tc>
+      </w:tr>
+      <w:tr>
+        <w:trPr>
+          <w:cantSplit/>
+        </w:trPr>
+        <w:tc>
+          <w:tcPr>
+            <w:tcW w:type="dxa" w:w="9360"/>
+            <w:tcBorders>
+              <w:top w:val="none" w:color="FFFFFF" w:sz="0"/>
+              <w:left w:val="none" w:color="FFFFFF" w:sz="0"/>
+              <w:bottom w:val="none" w:color="FFFFFF" w:sz="0"/>
+              <w:right w:val="none" w:color="FFFFFF" w:sz="0"/>
+            </w:tcBorders>
+            <w:shd w:fill="E8F1F8" w:color="auto" w:val="clear"/>
+            <w:tcMar>
+              <w:top w:type="dxa" w:w="0"/>
+              <w:left w:type="dxa" w:w="200"/>
+              <w:bottom w:type="dxa" w:w="150"/>
+              <w:right w:type="dxa" w:w="200"/>
+            </w:tcMar>
+          </w:tcPr>
+          <w:p>
+            <w:pPr>
+              <w:keepNext w:val="false"/>
+              <w:spacing w:after="100" w:line="264"/>
+            </w:pPr>
+            <w:r>
+              <w:rPr>
+                <w:rFonts w:ascii="Cambria" w:cs="Cambria" w:eastAsia="Cambria" w:hAnsi="Cambria"/>
+                <w:color w:val="333333"/>
+                <w:sz w:val="21"/>
+                <w:szCs w:val="21"/>
+              </w:rPr>
+              <w:t xml:space="preserve">limit: K</w:t>
+            </w:r>
+            <w:r>
+              <w:rPr>
+                <w:rFonts w:ascii="Cambria" w:cs="Cambria" w:eastAsia="Cambria" w:hAnsi="Cambria"/>
+                <w:color w:val="333333"/>
+                <w:sz w:val="21"/>
+                <w:szCs w:val="21"/>
+                <w:vertAlign w:val="subscript"/>
+              </w:rPr>
+              <w:t xml:space="preserve">p</w:t>
+            </w:r>
+            <w:r>
+              <w:rPr>
+                <w:rFonts w:ascii="Cambria" w:cs="Cambria" w:eastAsia="Cambria" w:hAnsi="Cambria"/>
+                <w:color w:val="333333"/>
+                <w:sz w:val="21"/>
+                <w:szCs w:val="21"/>
+              </w:rPr>
+              <w:t xml:space="preserve">Δ² &lt; 0.55</w:t>
+            </w:r>
+          </w:p>
+        </w:tc>
+      </w:tr>
+    </w:tbl>
+    <w:p>
+      <w:pPr>
+        <w:spacing w:after="120"/>
+      </w:pPr>
+    </w:p>
+    <w:p>
+      <w:pPr>
+        <w:keepNext w:val="false"/>
+        <w:spacing w:after="140" w:before="0" w:line="276"/>
+        <w:jc w:val="left"/>
+      </w:pPr>
+      <w:r>
+        <w:rPr>
+          <w:rFonts w:ascii="Cambria" w:cs="Cambria" w:eastAsia="Cambria" w:hAnsi="Cambria"/>
+          <w:b/>
+          <w:bCs/>
+          <w:color w:val="333333"/>
+          <w:sz w:val="22"/>
+          <w:szCs w:val="22"/>
+        </w:rPr>
+        <w:t xml:space="preserve">In the pre-lab and Lab 08.</w:t>
+      </w:r>
+      <w:r>
+        <w:rPr>
+          <w:rFonts w:ascii="Cambria" w:cs="Cambria" w:eastAsia="Cambria" w:hAnsi="Cambria"/>
+          <w:color w:val="333333"/>
+          <w:sz w:val="22"/>
+          <w:szCs w:val="22"/>
+        </w:rPr>
+        <w:t xml:space="preserve"> Pre-lab Task P.4 steps Equation H.25 forward in time, with and without the D term. Lab 08's Tasks C.3 to C.5 measure the same growth on the arm and find the limit of Equation 8.7.</w:t>
       </w:r>
     </w:p>
     <w:p>
@@ -15732,7 +17250,7 @@
         </w:rPr>
         <w:t xml:space="preserve">·  Week 6 lecture notes, §2.1 (the hand's effective mass), and the </w:t>
       </w:r>
-      <w:hyperlink w:history="1" r:id="rIdq8calxwxayi3jeph3f9xg">
+      <w:hyperlink w:history="1" r:id="rIdvg9zjuhlldnxp8kodum2n">
         <w:r>
           <w:rPr>
             <w:rFonts w:ascii="Cambria" w:cs="Cambria" w:eastAsia="Cambria" w:hAnsi="Cambria"/>

</xml_diff>